<commit_message>
Fix unused imports and update Tailwind 4 config to fix build pipeline
</commit_message>
<xml_diff>
--- a/RA2311003011810.docx
+++ b/RA2311003011810.docx
@@ -1,124 +1,153 @@
 
 <file path=word/document.xml><?xml version="1.0" encoding="utf-8"?>
-<w:document xmlns:a="http://schemas.openxmlformats.org/drawingml/2006/main" xmlns:cdr="http://schemas.openxmlformats.org/drawingml/2006/chartDrawing" xmlns:o="urn:schemas-microsoft-com:office:office" xmlns:pic="http://schemas.openxmlformats.org/drawingml/2006/picture" xmlns:r="http://schemas.openxmlformats.org/officeDocument/2006/relationships" xmlns:v="urn:schemas-microsoft-com:vml" xmlns:ve="http://schemas.openxmlformats.org/markup-compatibility/2006" xmlns:vt="http://schemas.openxmlformats.org/officeDocument/2006/docPropsVTypes" xmlns:w="http://schemas.openxmlformats.org/wordprocessingml/2006/main" xmlns:w10="urn:schemas-microsoft-com:office:word" xmlns:wp="http://schemas.openxmlformats.org/drawingml/2006/wordprocessingDrawing" xmlns:wne="http://schemas.microsoft.com/office/word/2006/wordml">
+<w:document xmlns:wpc="http://schemas.microsoft.com/office/word/2010/wordprocessingCanvas" xmlns:cx="http://schemas.microsoft.com/office/drawing/2014/chartex" xmlns:cx1="http://schemas.microsoft.com/office/drawing/2015/9/8/chartex" xmlns:cx2="http://schemas.microsoft.com/office/drawing/2015/10/21/chartex" xmlns:cx3="http://schemas.microsoft.com/office/drawing/2016/5/9/chartex" xmlns:cx4="http://schemas.microsoft.com/office/drawing/2016/5/10/chartex" xmlns:cx5="http://schemas.microsoft.com/office/drawing/2016/5/11/chartex" xmlns:cx6="http://schemas.microsoft.com/office/drawing/2016/5/12/chartex" xmlns:cx7="http://schemas.microsoft.com/office/drawing/2016/5/13/chartex" xmlns:cx8="http://schemas.microsoft.com/office/drawing/2016/5/14/chartex" xmlns:mc="http://schemas.openxmlformats.org/markup-compatibility/2006" xmlns:aink="http://schemas.microsoft.com/office/drawing/2016/ink" xmlns:am3d="http://schemas.microsoft.com/office/drawing/2017/model3d" xmlns:o="urn:schemas-microsoft-com:office:office" xmlns:oel="http://schemas.microsoft.com/office/2019/extlst" xmlns:r="http://schemas.openxmlformats.org/officeDocument/2006/relationships" xmlns:m="http://schemas.openxmlformats.org/officeDocument/2006/math" xmlns:v="urn:schemas-microsoft-com:vml" xmlns:wp14="http://schemas.microsoft.com/office/word/2010/wordprocessingDrawing" xmlns:wp="http://schemas.openxmlformats.org/drawingml/2006/wordprocessingDrawing" xmlns:w10="urn:schemas-microsoft-com:office:word" xmlns:w="http://schemas.openxmlformats.org/wordprocessingml/2006/main" xmlns:w14="http://schemas.microsoft.com/office/word/2010/wordml" xmlns:w15="http://schemas.microsoft.com/office/word/2012/wordml" xmlns:w16cex="http://schemas.microsoft.com/office/word/2018/wordml/cex" xmlns:w16cid="http://schemas.microsoft.com/office/word/2016/wordml/cid" xmlns:w16="http://schemas.microsoft.com/office/word/2018/wordml" xmlns:w16du="http://schemas.microsoft.com/office/word/2023/wordml/word16du" xmlns:w16sdtdh="http://schemas.microsoft.com/office/word/2020/wordml/sdtdatahash" xmlns:w16sdtfl="http://schemas.microsoft.com/office/word/2024/wordml/sdtformatlock" xmlns:w16se="http://schemas.microsoft.com/office/word/2015/wordml/symex" xmlns:wpg="http://schemas.microsoft.com/office/word/2010/wordprocessingGroup" xmlns:wpi="http://schemas.microsoft.com/office/word/2010/wordprocessingInk" xmlns:wne="http://schemas.microsoft.com/office/word/2006/wordml" xmlns:wps="http://schemas.microsoft.com/office/word/2010/wordprocessingShape" mc:Ignorable="w14 w15 w16se w16cid w16 w16cex w16sdtdh w16sdtfl w16du wp14">
   <w:body>
-    <w:sectPr>
-      <w:pgSz w:w="12240" w:h="15840" w:orient="portrait"/>
-      <w:pgMar w:top="1440" w:right="1800" w:bottom="1440" w:left="1800" w:header="720" w:footer="720" w:gutter="0"/>
-      <w:footerReference r:id="rId7" w:type="default"/>
-    </w:sectPr>
-    <w:p>
-      <w:pPr>
-        <w:spacing w:lineRule="auto"/>
-      </w:pPr>
-      <w:r>
-        <w:rPr/>
-        <w:t xml:space="preserve"> </w:t>
-      </w:r>
-    </w:p>
-    <w:p>
-      <w:pPr>
-        <w:spacing w:lineRule="auto"/>
-      </w:pPr>
-      <w:r>
-        <w:rPr/>
-        <w:t xml:space="preserve"/>
-      </w:r>
-    </w:p>
-    <w:p>
-      <w:pPr>
-        <w:pStyle w:val="Heading1"/>
-        <w:spacing w:lineRule="auto"/>
-      </w:pPr>
-      <w:r>
-        <w:rPr/>
-        <w:t xml:space="preserve">Distributed Job Scheduler - Assignment Submission</w:t>
-      </w:r>
-    </w:p>
-    <w:p>
-      <w:pPr>
-        <w:spacing w:lineRule="auto"/>
-      </w:pPr>
-      <w:r>
-        <w:rPr>
+    <w:p>
+      <w:pPr>
+        <w:jc w:val="center"/>
+        <w:rPr>
+          <w:rFonts w:asciiTheme="majorHAnsi" w:hAnsiTheme="majorHAnsi" w:cstheme="majorHAnsi"/>
           <w:b/>
-        </w:rPr>
-        <w:t xml:space="preserve">Name:</w:t>
-      </w:r>
-      <w:r>
-        <w:rPr/>
-        <w:t xml:space="preserve"> Harshit Ravindra Kulkarni</w:t>
-      </w:r>
-    </w:p>
-    <w:p>
-      <w:pPr>
-        <w:spacing w:lineRule="auto"/>
-      </w:pPr>
-      <w:r>
-        <w:rPr>
+          <w:bCs/>
+          <w:sz w:val="36"/>
+          <w:szCs w:val="36"/>
+        </w:rPr>
+      </w:pPr>
+      <w:r>
+        <w:rPr>
+          <w:rFonts w:asciiTheme="majorHAnsi" w:hAnsiTheme="majorHAnsi" w:cstheme="majorHAnsi"/>
           <w:b/>
-        </w:rPr>
-        <w:t xml:space="preserve">Roll No:</w:t>
-      </w:r>
-      <w:r>
-        <w:rPr/>
-        <w:t xml:space="preserve"> RA2311003011810</w:t>
+          <w:bCs/>
+          <w:sz w:val="36"/>
+          <w:szCs w:val="36"/>
+        </w:rPr>
+        <w:t>Distributed Job Scheduler - Assignment Submission</w:t>
+      </w:r>
+    </w:p>
+    <w:p>
+      <w:pPr>
+        <w:jc w:val="center"/>
+        <w:rPr>
+          <w:rFonts w:asciiTheme="majorHAnsi" w:hAnsiTheme="majorHAnsi" w:cstheme="majorHAnsi"/>
+          <w:b/>
+          <w:bCs/>
+          <w:sz w:val="36"/>
+          <w:szCs w:val="36"/>
+        </w:rPr>
+      </w:pPr>
+      <w:r>
+        <w:rPr>
+          <w:rFonts w:asciiTheme="majorHAnsi" w:hAnsiTheme="majorHAnsi" w:cstheme="majorHAnsi"/>
+          <w:b/>
+          <w:bCs/>
+          <w:sz w:val="36"/>
+          <w:szCs w:val="36"/>
+        </w:rPr>
+        <w:t>Name: Harshit Ravindra Kulkarni</w:t>
+      </w:r>
+    </w:p>
+    <w:p>
+      <w:pPr>
+        <w:jc w:val="center"/>
+        <w:rPr>
+          <w:rFonts w:asciiTheme="majorHAnsi" w:hAnsiTheme="majorHAnsi" w:cstheme="majorHAnsi"/>
+          <w:b/>
+          <w:bCs/>
+          <w:sz w:val="36"/>
+          <w:szCs w:val="36"/>
+        </w:rPr>
+      </w:pPr>
+      <w:r>
+        <w:rPr>
+          <w:rFonts w:asciiTheme="majorHAnsi" w:hAnsiTheme="majorHAnsi" w:cstheme="majorHAnsi"/>
+          <w:b/>
+          <w:bCs/>
+          <w:sz w:val="36"/>
+          <w:szCs w:val="36"/>
+        </w:rPr>
+        <w:t>Roll No: RA2311003011810</w:t>
       </w:r>
     </w:p>
     <w:p>
       <w:pPr>
         <w:pStyle w:val="Heading2"/>
-        <w:spacing w:lineRule="auto"/>
-      </w:pPr>
-      <w:r>
-        <w:rPr/>
-        <w:t xml:space="preserve">1. Source Code Repository</w:t>
-      </w:r>
-    </w:p>
-    <w:p>
-      <w:pPr>
-        <w:spacing w:lineRule="auto"/>
-      </w:pPr>
-      <w:r>
-        <w:rPr>
+        <w:rPr>
+          <w:rFonts w:asciiTheme="majorHAnsi" w:hAnsiTheme="majorHAnsi" w:cstheme="majorHAnsi"/>
+          <w:sz w:val="24"/>
+          <w:szCs w:val="24"/>
+        </w:rPr>
+      </w:pPr>
+      <w:r>
+        <w:rPr>
+          <w:rFonts w:asciiTheme="majorHAnsi" w:hAnsiTheme="majorHAnsi" w:cstheme="majorHAnsi"/>
+          <w:sz w:val="24"/>
+          <w:szCs w:val="24"/>
+        </w:rPr>
+        <w:t>1. Source Code Repository</w:t>
+      </w:r>
+    </w:p>
+    <w:p>
+      <w:pPr>
+        <w:rPr>
+          <w:rFonts w:asciiTheme="majorHAnsi" w:hAnsiTheme="majorHAnsi" w:cstheme="majorHAnsi"/>
+          <w:sz w:val="24"/>
+          <w:szCs w:val="24"/>
+        </w:rPr>
+      </w:pPr>
+      <w:r>
+        <w:rPr>
+          <w:rFonts w:asciiTheme="majorHAnsi" w:hAnsiTheme="majorHAnsi" w:cstheme="majorHAnsi"/>
           <w:b/>
-        </w:rPr>
-        <w:t xml:space="preserve">GitHub Link:</w:t>
-      </w:r>
-      <w:hyperlink r:id="rId6">
+          <w:sz w:val="24"/>
+          <w:szCs w:val="24"/>
+        </w:rPr>
+        <w:t>GitHub Link:</w:t>
+      </w:r>
+      <w:hyperlink r:id="rId7">
         <w:r>
           <w:rPr>
             <w:rStyle w:val="Hyperlink"/>
+            <w:rFonts w:asciiTheme="majorHAnsi" w:hAnsiTheme="majorHAnsi" w:cstheme="majorHAnsi"/>
+            <w:sz w:val="24"/>
+            <w:szCs w:val="24"/>
           </w:rPr>
-          <w:t xml:space="preserve">https://github.com/kulharshit21/distributed-job-scheduler-submission</w:t>
+          <w:t>https://github.com/kulharshit21/distributed-job-scheduler-submission</w:t>
         </w:r>
       </w:hyperlink>
     </w:p>
     <w:p>
       <w:pPr>
-        <w:spacing w:lineRule="auto"/>
-      </w:pPr>
-      <w:r>
-        <w:rPr/>
-        <w:t xml:space="preserve">Please check the </w:t>
-      </w:r>
-      <w:r>
-        <w:rPr/>
-        <w:t xml:space="preserve">README.md</w:t>
-      </w:r>
-      <w:r>
-        <w:rPr/>
-        <w:t xml:space="preserve"> in the repository for detailed setup and run instructions.</w:t>
+        <w:rPr>
+          <w:rFonts w:asciiTheme="majorHAnsi" w:hAnsiTheme="majorHAnsi" w:cstheme="majorHAnsi"/>
+          <w:sz w:val="24"/>
+          <w:szCs w:val="24"/>
+        </w:rPr>
+      </w:pPr>
+      <w:r>
+        <w:rPr>
+          <w:rFonts w:asciiTheme="majorHAnsi" w:hAnsiTheme="majorHAnsi" w:cstheme="majorHAnsi"/>
+          <w:sz w:val="24"/>
+          <w:szCs w:val="24"/>
+        </w:rPr>
+        <w:t>Please check the README.md in the repository for detailed setup and run instructions.</w:t>
       </w:r>
     </w:p>
     <w:p>
       <w:pPr>
         <w:pStyle w:val="Heading2"/>
-        <w:spacing w:lineRule="auto"/>
-      </w:pPr>
-      <w:r>
-        <w:rPr/>
-        <w:t xml:space="preserve">2. Deployment Strategy</w:t>
+        <w:rPr>
+          <w:rFonts w:asciiTheme="majorHAnsi" w:hAnsiTheme="majorHAnsi" w:cstheme="majorHAnsi"/>
+          <w:sz w:val="24"/>
+          <w:szCs w:val="24"/>
+        </w:rPr>
+      </w:pPr>
+      <w:r>
+        <w:rPr>
+          <w:rFonts w:asciiTheme="majorHAnsi" w:hAnsiTheme="majorHAnsi" w:cstheme="majorHAnsi"/>
+          <w:sz w:val="24"/>
+          <w:szCs w:val="24"/>
+        </w:rPr>
+        <w:t>2. Deployment Strategy</w:t>
       </w:r>
     </w:p>
     <w:p>
@@ -127,18 +156,39 @@
           <w:ilvl w:val="0"/>
           <w:numId w:val="1"/>
         </w:numPr>
-        <w:spacing w:lineRule="auto"/>
-      </w:pPr>
-      <w:r>
-        <w:rPr>
+        <w:rPr>
+          <w:rFonts w:asciiTheme="majorHAnsi" w:hAnsiTheme="majorHAnsi" w:cstheme="majorHAnsi"/>
+          <w:sz w:val="24"/>
+          <w:szCs w:val="24"/>
+        </w:rPr>
+      </w:pPr>
+      <w:r>
+        <w:rPr>
+          <w:rFonts w:asciiTheme="majorHAnsi" w:hAnsiTheme="majorHAnsi" w:cstheme="majorHAnsi"/>
           <w:b/>
-        </w:rPr>
-        <w:t xml:space="preserve">Frontend (React/Vite):</w:t>
-      </w:r>
-      <w:r>
-        <w:rPr/>
-        <w:t xml:space="preserve"> Vercel</w:t>
-      </w:r>
+          <w:sz w:val="24"/>
+          <w:szCs w:val="24"/>
+        </w:rPr>
+        <w:t>Frontend (React/Vite):</w:t>
+      </w:r>
+      <w:r>
+        <w:rPr>
+          <w:rFonts w:asciiTheme="majorHAnsi" w:hAnsiTheme="majorHAnsi" w:cstheme="majorHAnsi"/>
+          <w:sz w:val="24"/>
+          <w:szCs w:val="24"/>
+        </w:rPr>
+        <w:t xml:space="preserve"> </w:t>
+      </w:r>
+      <w:proofErr w:type="spellStart"/>
+      <w:r>
+        <w:rPr>
+          <w:rFonts w:asciiTheme="majorHAnsi" w:hAnsiTheme="majorHAnsi" w:cstheme="majorHAnsi"/>
+          <w:sz w:val="24"/>
+          <w:szCs w:val="24"/>
+        </w:rPr>
+        <w:t>Vercel</w:t>
+      </w:r>
+      <w:proofErr w:type="spellEnd"/>
     </w:p>
     <w:p>
       <w:pPr>
@@ -146,16 +196,47 @@
           <w:ilvl w:val="0"/>
           <w:numId w:val="1"/>
         </w:numPr>
-        <w:spacing w:lineRule="auto"/>
-      </w:pPr>
-      <w:r>
-        <w:rPr>
+        <w:rPr>
+          <w:rFonts w:asciiTheme="majorHAnsi" w:hAnsiTheme="majorHAnsi" w:cstheme="majorHAnsi"/>
+          <w:sz w:val="24"/>
+          <w:szCs w:val="24"/>
+        </w:rPr>
+      </w:pPr>
+      <w:r>
+        <w:rPr>
+          <w:rFonts w:asciiTheme="majorHAnsi" w:hAnsiTheme="majorHAnsi" w:cstheme="majorHAnsi"/>
           <w:b/>
-        </w:rPr>
-        <w:t xml:space="preserve">API Service (NestJS):</w:t>
-      </w:r>
-      <w:r>
-        <w:rPr/>
+          <w:sz w:val="24"/>
+          <w:szCs w:val="24"/>
+        </w:rPr>
+        <w:t>API Service (</w:t>
+      </w:r>
+      <w:proofErr w:type="spellStart"/>
+      <w:r>
+        <w:rPr>
+          <w:rFonts w:asciiTheme="majorHAnsi" w:hAnsiTheme="majorHAnsi" w:cstheme="majorHAnsi"/>
+          <w:b/>
+          <w:sz w:val="24"/>
+          <w:szCs w:val="24"/>
+        </w:rPr>
+        <w:t>NestJS</w:t>
+      </w:r>
+      <w:proofErr w:type="spellEnd"/>
+      <w:r>
+        <w:rPr>
+          <w:rFonts w:asciiTheme="majorHAnsi" w:hAnsiTheme="majorHAnsi" w:cstheme="majorHAnsi"/>
+          <w:b/>
+          <w:sz w:val="24"/>
+          <w:szCs w:val="24"/>
+        </w:rPr>
+        <w:t>):</w:t>
+      </w:r>
+      <w:r>
+        <w:rPr>
+          <w:rFonts w:asciiTheme="majorHAnsi" w:hAnsiTheme="majorHAnsi" w:cstheme="majorHAnsi"/>
+          <w:sz w:val="24"/>
+          <w:szCs w:val="24"/>
+        </w:rPr>
         <w:t xml:space="preserve"> Railway</w:t>
       </w:r>
     </w:p>
@@ -165,16 +246,47 @@
           <w:ilvl w:val="0"/>
           <w:numId w:val="1"/>
         </w:numPr>
-        <w:spacing w:lineRule="auto"/>
-      </w:pPr>
-      <w:r>
-        <w:rPr>
+        <w:rPr>
+          <w:rFonts w:asciiTheme="majorHAnsi" w:hAnsiTheme="majorHAnsi" w:cstheme="majorHAnsi"/>
+          <w:sz w:val="24"/>
+          <w:szCs w:val="24"/>
+        </w:rPr>
+      </w:pPr>
+      <w:r>
+        <w:rPr>
+          <w:rFonts w:asciiTheme="majorHAnsi" w:hAnsiTheme="majorHAnsi" w:cstheme="majorHAnsi"/>
           <w:b/>
-        </w:rPr>
-        <w:t xml:space="preserve">Worker Service (NestJS):</w:t>
-      </w:r>
-      <w:r>
-        <w:rPr/>
+          <w:sz w:val="24"/>
+          <w:szCs w:val="24"/>
+        </w:rPr>
+        <w:t>Worker Service (</w:t>
+      </w:r>
+      <w:proofErr w:type="spellStart"/>
+      <w:r>
+        <w:rPr>
+          <w:rFonts w:asciiTheme="majorHAnsi" w:hAnsiTheme="majorHAnsi" w:cstheme="majorHAnsi"/>
+          <w:b/>
+          <w:sz w:val="24"/>
+          <w:szCs w:val="24"/>
+        </w:rPr>
+        <w:t>NestJS</w:t>
+      </w:r>
+      <w:proofErr w:type="spellEnd"/>
+      <w:r>
+        <w:rPr>
+          <w:rFonts w:asciiTheme="majorHAnsi" w:hAnsiTheme="majorHAnsi" w:cstheme="majorHAnsi"/>
+          <w:b/>
+          <w:sz w:val="24"/>
+          <w:szCs w:val="24"/>
+        </w:rPr>
+        <w:t>):</w:t>
+      </w:r>
+      <w:r>
+        <w:rPr>
+          <w:rFonts w:asciiTheme="majorHAnsi" w:hAnsiTheme="majorHAnsi" w:cstheme="majorHAnsi"/>
+          <w:sz w:val="24"/>
+          <w:szCs w:val="24"/>
+        </w:rPr>
         <w:t xml:space="preserve"> Railway</w:t>
       </w:r>
     </w:p>
@@ -184,72 +296,199 @@
           <w:ilvl w:val="0"/>
           <w:numId w:val="1"/>
         </w:numPr>
-        <w:spacing w:lineRule="auto"/>
-      </w:pPr>
-      <w:r>
-        <w:rPr>
+        <w:rPr>
+          <w:rFonts w:asciiTheme="majorHAnsi" w:hAnsiTheme="majorHAnsi" w:cstheme="majorHAnsi"/>
+          <w:sz w:val="24"/>
+          <w:szCs w:val="24"/>
+        </w:rPr>
+      </w:pPr>
+      <w:r>
+        <w:rPr>
+          <w:rFonts w:asciiTheme="majorHAnsi" w:hAnsiTheme="majorHAnsi" w:cstheme="majorHAnsi"/>
           <w:b/>
-        </w:rPr>
-        <w:t xml:space="preserve">Database (PostgreSQL &amp; Redis):</w:t>
-      </w:r>
-      <w:r>
-        <w:rPr/>
+          <w:sz w:val="24"/>
+          <w:szCs w:val="24"/>
+        </w:rPr>
+        <w:t>Database (PostgreSQL &amp; Redis):</w:t>
+      </w:r>
+      <w:r>
+        <w:rPr>
+          <w:rFonts w:asciiTheme="majorHAnsi" w:hAnsiTheme="majorHAnsi" w:cstheme="majorHAnsi"/>
+          <w:sz w:val="24"/>
+          <w:szCs w:val="24"/>
+        </w:rPr>
         <w:t xml:space="preserve"> Railway</w:t>
       </w:r>
     </w:p>
     <w:p>
       <w:pPr>
         <w:pStyle w:val="Heading2"/>
-        <w:spacing w:lineRule="auto"/>
-      </w:pPr>
-      <w:r>
-        <w:rPr/>
-        <w:t xml:space="preserve">3. System Architecture</w:t>
-      </w:r>
-    </w:p>
-    <w:p>
-      <w:pPr>
-        <w:spacing w:lineRule="auto"/>
-      </w:pPr>
-      <w:r>
-        <w:rPr/>
-        <w:t xml:space="preserve">The system uses a microservices approach inside a monorepo. The API service handles incoming HTTP requests and WebSocket connections, while the Worker service is a headless application that processes background jobs. They share a database via the Prisma ORM.</w:t>
-      </w:r>
-    </w:p>
-    <w:p>
-      <w:pPr>
-        <w:spacing w:lineRule="auto"/>
-      </w:pPr>
-      <w:r>
-        <w:rPr/>
-        <w:t xml:space="preserve">For concurrency control, I used PostgreSQL's </w:t>
-      </w:r>
-      <w:r>
-        <w:rPr/>
-        <w:t xml:space="preserve">FOR UPDATE SKIP LOCKED</w:t>
-      </w:r>
-      <w:r>
-        <w:rPr/>
-        <w:t xml:space="preserve"> instead of external message brokers like RabbitMQ or Kafka. This ensures atomicity and prevents multiple workers from processing the same job.</w:t>
+        <w:rPr>
+          <w:rFonts w:asciiTheme="majorHAnsi" w:hAnsiTheme="majorHAnsi" w:cstheme="majorHAnsi"/>
+          <w:sz w:val="24"/>
+          <w:szCs w:val="24"/>
+        </w:rPr>
+      </w:pPr>
+      <w:r>
+        <w:rPr>
+          <w:rFonts w:asciiTheme="majorHAnsi" w:hAnsiTheme="majorHAnsi" w:cstheme="majorHAnsi"/>
+          <w:sz w:val="24"/>
+          <w:szCs w:val="24"/>
+        </w:rPr>
+        <w:t>3. System Architecture</w:t>
+      </w:r>
+    </w:p>
+    <w:p>
+      <w:pPr>
+        <w:jc w:val="both"/>
+        <w:rPr>
+          <w:rFonts w:asciiTheme="majorHAnsi" w:hAnsiTheme="majorHAnsi" w:cstheme="majorHAnsi"/>
+          <w:sz w:val="24"/>
+          <w:szCs w:val="24"/>
+        </w:rPr>
+      </w:pPr>
+      <w:r>
+        <w:rPr>
+          <w:rFonts w:asciiTheme="majorHAnsi" w:hAnsiTheme="majorHAnsi" w:cstheme="majorHAnsi"/>
+          <w:sz w:val="24"/>
+          <w:szCs w:val="24"/>
+        </w:rPr>
+        <w:t xml:space="preserve">The system uses a microservices approach inside a </w:t>
+      </w:r>
+      <w:proofErr w:type="spellStart"/>
+      <w:r>
+        <w:rPr>
+          <w:rFonts w:asciiTheme="majorHAnsi" w:hAnsiTheme="majorHAnsi" w:cstheme="majorHAnsi"/>
+          <w:sz w:val="24"/>
+          <w:szCs w:val="24"/>
+        </w:rPr>
+        <w:t>monorepo</w:t>
+      </w:r>
+      <w:proofErr w:type="spellEnd"/>
+      <w:r>
+        <w:rPr>
+          <w:rFonts w:asciiTheme="majorHAnsi" w:hAnsiTheme="majorHAnsi" w:cstheme="majorHAnsi"/>
+          <w:sz w:val="24"/>
+          <w:szCs w:val="24"/>
+        </w:rPr>
+        <w:t>. The API service handles incoming HTTP requests and WebSocket connections, while the Worker service is a headless application that processes background jobs. They share a database via the Prisma ORM.</w:t>
+      </w:r>
+    </w:p>
+    <w:p>
+      <w:pPr>
+        <w:jc w:val="both"/>
+        <w:rPr>
+          <w:rFonts w:asciiTheme="majorHAnsi" w:hAnsiTheme="majorHAnsi" w:cstheme="majorHAnsi"/>
+          <w:sz w:val="24"/>
+          <w:szCs w:val="24"/>
+        </w:rPr>
+      </w:pPr>
+      <w:r>
+        <w:rPr>
+          <w:rFonts w:asciiTheme="majorHAnsi" w:hAnsiTheme="majorHAnsi" w:cstheme="majorHAnsi"/>
+          <w:sz w:val="24"/>
+          <w:szCs w:val="24"/>
+        </w:rPr>
+        <w:t>For concurrency control, I used PostgreSQL's FOR UPDATE SKIP LOCKED instead of external message brokers like RabbitMQ or Kafka. This ensures atomicity and prevents multiple workers from processing the same job.</w:t>
+      </w:r>
+    </w:p>
+    <w:p>
+      <w:pPr>
+        <w:jc w:val="center"/>
+        <w:rPr>
+          <w:rFonts w:asciiTheme="majorHAnsi" w:hAnsiTheme="majorHAnsi" w:cstheme="majorHAnsi"/>
+          <w:sz w:val="24"/>
+          <w:szCs w:val="24"/>
+        </w:rPr>
+      </w:pPr>
+      <w:r>
+        <w:rPr>
+          <w:noProof/>
+        </w:rPr>
+        <w:drawing>
+          <wp:inline distT="0" distB="0" distL="0" distR="0" wp14:anchorId="59D25621" wp14:editId="557332AE">
+            <wp:extent cx="5566867" cy="3711774"/>
+            <wp:effectExtent l="0" t="0" r="0" b="0"/>
+            <wp:docPr id="2052268523" name="Picture 1" descr="The image depicts a distributed job scheduler architecture with frontend, backend services, persistence layer, and various components like REST API, PostgreSQL, Redis, and NestJS, highlighting features such as horizontal scalability, fault tolerance, and real-time telemetry.&#10;&#10;AI-generated content may be incorrect."/>
+            <wp:cNvGraphicFramePr>
+              <a:graphicFrameLocks xmlns:a="http://schemas.openxmlformats.org/drawingml/2006/main" noChangeAspect="1"/>
+            </wp:cNvGraphicFramePr>
+            <a:graphic xmlns:a="http://schemas.openxmlformats.org/drawingml/2006/main">
+              <a:graphicData uri="http://schemas.openxmlformats.org/drawingml/2006/picture">
+                <pic:pic xmlns:pic="http://schemas.openxmlformats.org/drawingml/2006/picture">
+                  <pic:nvPicPr>
+                    <pic:cNvPr id="2052268523" name="Picture 1" descr="The image depicts a distributed job scheduler architecture with frontend, backend services, persistence layer, and various components like REST API, PostgreSQL, Redis, and NestJS, highlighting features such as horizontal scalability, fault tolerance, and real-time telemetry.&#10;&#10;AI-generated content may be incorrect."/>
+                    <pic:cNvPicPr>
+                      <a:picLocks noChangeAspect="1" noChangeArrowheads="1"/>
+                    </pic:cNvPicPr>
+                  </pic:nvPicPr>
+                  <pic:blipFill>
+                    <a:blip r:embed="rId8" cstate="print">
+                      <a:extLst>
+                        <a:ext uri="{28A0092B-C50C-407E-A947-70E740481C1C}">
+                          <a14:useLocalDpi xmlns:a14="http://schemas.microsoft.com/office/drawing/2010/main" val="0"/>
+                        </a:ext>
+                      </a:extLst>
+                    </a:blip>
+                    <a:srcRect/>
+                    <a:stretch>
+                      <a:fillRect/>
+                    </a:stretch>
+                  </pic:blipFill>
+                  <pic:spPr bwMode="auto">
+                    <a:xfrm>
+                      <a:off x="0" y="0"/>
+                      <a:ext cx="5570303" cy="3714065"/>
+                    </a:xfrm>
+                    <a:prstGeom prst="rect">
+                      <a:avLst/>
+                    </a:prstGeom>
+                    <a:noFill/>
+                    <a:ln>
+                      <a:noFill/>
+                    </a:ln>
+                  </pic:spPr>
+                </pic:pic>
+              </a:graphicData>
+            </a:graphic>
+          </wp:inline>
+        </w:drawing>
       </w:r>
     </w:p>
     <w:p>
       <w:pPr>
         <w:pStyle w:val="Heading2"/>
-        <w:spacing w:lineRule="auto"/>
-      </w:pPr>
-      <w:r>
-        <w:rPr/>
-        <w:t xml:space="preserve">4. Database Design (Entity-Relationship)</w:t>
-      </w:r>
-    </w:p>
-    <w:p>
-      <w:pPr>
-        <w:spacing w:lineRule="auto"/>
-      </w:pPr>
-      <w:r>
-        <w:rPr/>
-        <w:t xml:space="preserve">The core tables are:</w:t>
+        <w:rPr>
+          <w:rFonts w:asciiTheme="majorHAnsi" w:hAnsiTheme="majorHAnsi" w:cstheme="majorHAnsi"/>
+          <w:sz w:val="24"/>
+          <w:szCs w:val="24"/>
+        </w:rPr>
+      </w:pPr>
+      <w:r>
+        <w:rPr>
+          <w:rFonts w:asciiTheme="majorHAnsi" w:hAnsiTheme="majorHAnsi" w:cstheme="majorHAnsi"/>
+          <w:sz w:val="24"/>
+          <w:szCs w:val="24"/>
+        </w:rPr>
+        <w:lastRenderedPageBreak/>
+        <w:t>4. Database Design (Entity-Relationship)</w:t>
+      </w:r>
+    </w:p>
+    <w:p>
+      <w:pPr>
+        <w:rPr>
+          <w:rFonts w:asciiTheme="majorHAnsi" w:hAnsiTheme="majorHAnsi" w:cstheme="majorHAnsi"/>
+          <w:sz w:val="24"/>
+          <w:szCs w:val="24"/>
+        </w:rPr>
+      </w:pPr>
+      <w:r>
+        <w:rPr>
+          <w:rFonts w:asciiTheme="majorHAnsi" w:hAnsiTheme="majorHAnsi" w:cstheme="majorHAnsi"/>
+          <w:sz w:val="24"/>
+          <w:szCs w:val="24"/>
+        </w:rPr>
+        <w:t>The core tables are:</w:t>
       </w:r>
     </w:p>
     <w:p>
@@ -258,16 +497,27 @@
           <w:ilvl w:val="0"/>
           <w:numId w:val="2"/>
         </w:numPr>
-        <w:spacing w:lineRule="auto"/>
-      </w:pPr>
-      <w:r>
-        <w:rPr>
+        <w:rPr>
+          <w:rFonts w:asciiTheme="majorHAnsi" w:hAnsiTheme="majorHAnsi" w:cstheme="majorHAnsi"/>
+          <w:sz w:val="24"/>
+          <w:szCs w:val="24"/>
+        </w:rPr>
+      </w:pPr>
+      <w:r>
+        <w:rPr>
+          <w:rFonts w:asciiTheme="majorHAnsi" w:hAnsiTheme="majorHAnsi" w:cstheme="majorHAnsi"/>
           <w:b/>
-        </w:rPr>
-        <w:t xml:space="preserve">Queue:</w:t>
-      </w:r>
-      <w:r>
-        <w:rPr/>
+          <w:sz w:val="24"/>
+          <w:szCs w:val="24"/>
+        </w:rPr>
+        <w:t>Queue:</w:t>
+      </w:r>
+      <w:r>
+        <w:rPr>
+          <w:rFonts w:asciiTheme="majorHAnsi" w:hAnsiTheme="majorHAnsi" w:cstheme="majorHAnsi"/>
+          <w:sz w:val="24"/>
+          <w:szCs w:val="24"/>
+        </w:rPr>
         <w:t xml:space="preserve"> Manages concurrency limits and holds jobs.</w:t>
       </w:r>
     </w:p>
@@ -277,16 +527,27 @@
           <w:ilvl w:val="0"/>
           <w:numId w:val="2"/>
         </w:numPr>
-        <w:spacing w:lineRule="auto"/>
-      </w:pPr>
-      <w:r>
-        <w:rPr>
+        <w:rPr>
+          <w:rFonts w:asciiTheme="majorHAnsi" w:hAnsiTheme="majorHAnsi" w:cstheme="majorHAnsi"/>
+          <w:sz w:val="24"/>
+          <w:szCs w:val="24"/>
+        </w:rPr>
+      </w:pPr>
+      <w:r>
+        <w:rPr>
+          <w:rFonts w:asciiTheme="majorHAnsi" w:hAnsiTheme="majorHAnsi" w:cstheme="majorHAnsi"/>
           <w:b/>
-        </w:rPr>
-        <w:t xml:space="preserve">Job:</w:t>
-      </w:r>
-      <w:r>
-        <w:rPr/>
+          <w:sz w:val="24"/>
+          <w:szCs w:val="24"/>
+        </w:rPr>
+        <w:t>Job:</w:t>
+      </w:r>
+      <w:r>
+        <w:rPr>
+          <w:rFonts w:asciiTheme="majorHAnsi" w:hAnsiTheme="majorHAnsi" w:cstheme="majorHAnsi"/>
+          <w:sz w:val="24"/>
+          <w:szCs w:val="24"/>
+        </w:rPr>
         <w:t xml:space="preserve"> Stores the payload, execution status, retries, and lock timing.</w:t>
       </w:r>
     </w:p>
@@ -296,16 +557,38 @@
           <w:ilvl w:val="0"/>
           <w:numId w:val="2"/>
         </w:numPr>
-        <w:spacing w:lineRule="auto"/>
-      </w:pPr>
-      <w:r>
-        <w:rPr>
+        <w:rPr>
+          <w:rFonts w:asciiTheme="majorHAnsi" w:hAnsiTheme="majorHAnsi" w:cstheme="majorHAnsi"/>
+          <w:sz w:val="24"/>
+          <w:szCs w:val="24"/>
+        </w:rPr>
+      </w:pPr>
+      <w:proofErr w:type="spellStart"/>
+      <w:r>
+        <w:rPr>
+          <w:rFonts w:asciiTheme="majorHAnsi" w:hAnsiTheme="majorHAnsi" w:cstheme="majorHAnsi"/>
           <w:b/>
-        </w:rPr>
-        <w:t xml:space="preserve">JobExecution:</w:t>
-      </w:r>
-      <w:r>
-        <w:rPr/>
+          <w:sz w:val="24"/>
+          <w:szCs w:val="24"/>
+        </w:rPr>
+        <w:t>JobExecution</w:t>
+      </w:r>
+      <w:proofErr w:type="spellEnd"/>
+      <w:r>
+        <w:rPr>
+          <w:rFonts w:asciiTheme="majorHAnsi" w:hAnsiTheme="majorHAnsi" w:cstheme="majorHAnsi"/>
+          <w:b/>
+          <w:sz w:val="24"/>
+          <w:szCs w:val="24"/>
+        </w:rPr>
+        <w:t>:</w:t>
+      </w:r>
+      <w:r>
+        <w:rPr>
+          <w:rFonts w:asciiTheme="majorHAnsi" w:hAnsiTheme="majorHAnsi" w:cstheme="majorHAnsi"/>
+          <w:sz w:val="24"/>
+          <w:szCs w:val="24"/>
+        </w:rPr>
         <w:t xml:space="preserve"> Logs start and end times for tracking.</w:t>
       </w:r>
     </w:p>
@@ -315,27 +598,126 @@
           <w:ilvl w:val="0"/>
           <w:numId w:val="2"/>
         </w:numPr>
-        <w:spacing w:lineRule="auto"/>
-      </w:pPr>
-      <w:r>
-        <w:rPr>
+        <w:rPr>
+          <w:rFonts w:asciiTheme="majorHAnsi" w:hAnsiTheme="majorHAnsi" w:cstheme="majorHAnsi"/>
+          <w:sz w:val="24"/>
+          <w:szCs w:val="24"/>
+        </w:rPr>
+      </w:pPr>
+      <w:proofErr w:type="spellStart"/>
+      <w:r>
+        <w:rPr>
+          <w:rFonts w:asciiTheme="majorHAnsi" w:hAnsiTheme="majorHAnsi" w:cstheme="majorHAnsi"/>
           <w:b/>
-        </w:rPr>
-        <w:t xml:space="preserve">DeadLetterQueue:</w:t>
-      </w:r>
-      <w:r>
-        <w:rPr/>
+          <w:sz w:val="24"/>
+          <w:szCs w:val="24"/>
+        </w:rPr>
+        <w:t>DeadLetterQueue</w:t>
+      </w:r>
+      <w:proofErr w:type="spellEnd"/>
+      <w:r>
+        <w:rPr>
+          <w:rFonts w:asciiTheme="majorHAnsi" w:hAnsiTheme="majorHAnsi" w:cstheme="majorHAnsi"/>
+          <w:b/>
+          <w:sz w:val="24"/>
+          <w:szCs w:val="24"/>
+        </w:rPr>
+        <w:t>:</w:t>
+      </w:r>
+      <w:r>
+        <w:rPr>
+          <w:rFonts w:asciiTheme="majorHAnsi" w:hAnsiTheme="majorHAnsi" w:cstheme="majorHAnsi"/>
+          <w:sz w:val="24"/>
+          <w:szCs w:val="24"/>
+        </w:rPr>
         <w:t xml:space="preserve"> Stores permanently failed jobs.</w:t>
       </w:r>
+      <w:r>
+        <w:rPr>
+          <w:rFonts w:asciiTheme="majorHAnsi" w:hAnsiTheme="majorHAnsi" w:cstheme="majorHAnsi"/>
+          <w:sz w:val="24"/>
+          <w:szCs w:val="24"/>
+        </w:rPr>
+        <w:br/>
+      </w:r>
+      <w:r>
+        <w:rPr>
+          <w:rFonts w:asciiTheme="majorHAnsi" w:hAnsiTheme="majorHAnsi" w:cstheme="majorHAnsi"/>
+          <w:sz w:val="24"/>
+          <w:szCs w:val="24"/>
+        </w:rPr>
+        <w:br/>
+      </w:r>
+      <w:r>
+        <w:rPr>
+          <w:noProof/>
+        </w:rPr>
+        <w:drawing>
+          <wp:inline distT="0" distB="0" distL="0" distR="0" wp14:anchorId="381D9FE6" wp14:editId="7234D710">
+            <wp:extent cx="6038698" cy="4443095"/>
+            <wp:effectExtent l="0" t="0" r="0" b="0"/>
+            <wp:docPr id="624215187" name="Picture 2"/>
+            <wp:cNvGraphicFramePr>
+              <a:graphicFrameLocks xmlns:a="http://schemas.openxmlformats.org/drawingml/2006/main" noChangeAspect="1"/>
+            </wp:cNvGraphicFramePr>
+            <a:graphic xmlns:a="http://schemas.openxmlformats.org/drawingml/2006/main">
+              <a:graphicData uri="http://schemas.openxmlformats.org/drawingml/2006/picture">
+                <pic:pic xmlns:pic="http://schemas.openxmlformats.org/drawingml/2006/picture">
+                  <pic:nvPicPr>
+                    <pic:cNvPr id="624215187" name="Picture 2"/>
+                    <pic:cNvPicPr>
+                      <a:picLocks noChangeAspect="1" noChangeArrowheads="1"/>
+                    </pic:cNvPicPr>
+                  </pic:nvPicPr>
+                  <pic:blipFill>
+                    <a:blip r:embed="rId9" cstate="print">
+                      <a:extLst>
+                        <a:ext uri="{28A0092B-C50C-407E-A947-70E740481C1C}">
+                          <a14:useLocalDpi xmlns:a14="http://schemas.microsoft.com/office/drawing/2010/main" val="0"/>
+                        </a:ext>
+                      </a:extLst>
+                    </a:blip>
+                    <a:srcRect/>
+                    <a:stretch>
+                      <a:fillRect/>
+                    </a:stretch>
+                  </pic:blipFill>
+                  <pic:spPr bwMode="auto">
+                    <a:xfrm>
+                      <a:off x="0" y="0"/>
+                      <a:ext cx="6042628" cy="4445987"/>
+                    </a:xfrm>
+                    <a:prstGeom prst="rect">
+                      <a:avLst/>
+                    </a:prstGeom>
+                    <a:noFill/>
+                    <a:ln>
+                      <a:noFill/>
+                    </a:ln>
+                  </pic:spPr>
+                </pic:pic>
+              </a:graphicData>
+            </a:graphic>
+          </wp:inline>
+        </w:drawing>
+      </w:r>
     </w:p>
     <w:p>
       <w:pPr>
         <w:pStyle w:val="Heading2"/>
-        <w:spacing w:lineRule="auto"/>
-      </w:pPr>
-      <w:r>
-        <w:rPr/>
-        <w:t xml:space="preserve">5. Concurrency and Reliability</w:t>
+        <w:rPr>
+          <w:rFonts w:asciiTheme="majorHAnsi" w:hAnsiTheme="majorHAnsi" w:cstheme="majorHAnsi"/>
+          <w:sz w:val="24"/>
+          <w:szCs w:val="24"/>
+        </w:rPr>
+      </w:pPr>
+      <w:r>
+        <w:rPr>
+          <w:rFonts w:asciiTheme="majorHAnsi" w:hAnsiTheme="majorHAnsi" w:cstheme="majorHAnsi"/>
+          <w:sz w:val="24"/>
+          <w:szCs w:val="24"/>
+        </w:rPr>
+        <w:t>5. Concurrency and Reliability</w:t>
       </w:r>
     </w:p>
     <w:p>
@@ -344,16 +726,27 @@
           <w:ilvl w:val="0"/>
           <w:numId w:val="3"/>
         </w:numPr>
-        <w:spacing w:lineRule="auto"/>
-      </w:pPr>
-      <w:r>
-        <w:rPr>
+        <w:rPr>
+          <w:rFonts w:asciiTheme="majorHAnsi" w:hAnsiTheme="majorHAnsi" w:cstheme="majorHAnsi"/>
+          <w:sz w:val="24"/>
+          <w:szCs w:val="24"/>
+        </w:rPr>
+      </w:pPr>
+      <w:r>
+        <w:rPr>
+          <w:rFonts w:asciiTheme="majorHAnsi" w:hAnsiTheme="majorHAnsi" w:cstheme="majorHAnsi"/>
           <w:b/>
-        </w:rPr>
-        <w:t xml:space="preserve">Queue-Level Concurrency:</w:t>
-      </w:r>
-      <w:r>
-        <w:rPr/>
+          <w:sz w:val="24"/>
+          <w:szCs w:val="24"/>
+        </w:rPr>
+        <w:t>Queue-Level Concurrency:</w:t>
+      </w:r>
+      <w:r>
+        <w:rPr>
+          <w:rFonts w:asciiTheme="majorHAnsi" w:hAnsiTheme="majorHAnsi" w:cstheme="majorHAnsi"/>
+          <w:sz w:val="24"/>
+          <w:szCs w:val="24"/>
+        </w:rPr>
         <w:t xml:space="preserve"> Implemented a token bucket pattern to enforce limits on concurrent job execution per queue.</w:t>
       </w:r>
     </w:p>
@@ -363,17 +756,46 @@
           <w:ilvl w:val="0"/>
           <w:numId w:val="3"/>
         </w:numPr>
-        <w:spacing w:lineRule="auto"/>
-      </w:pPr>
-      <w:r>
-        <w:rPr>
+        <w:rPr>
+          <w:rFonts w:asciiTheme="majorHAnsi" w:hAnsiTheme="majorHAnsi" w:cstheme="majorHAnsi"/>
+          <w:sz w:val="24"/>
+          <w:szCs w:val="24"/>
+        </w:rPr>
+      </w:pPr>
+      <w:r>
+        <w:rPr>
+          <w:rFonts w:asciiTheme="majorHAnsi" w:hAnsiTheme="majorHAnsi" w:cstheme="majorHAnsi"/>
           <w:b/>
-        </w:rPr>
-        <w:t xml:space="preserve">Orphan Job Recovery:</w:t>
-      </w:r>
-      <w:r>
-        <w:rPr/>
-        <w:t xml:space="preserve"> A watchdog cron job checks for jobs stuck in the 'RUNNING' state past their lock timeout and requeues them automatically.</w:t>
+          <w:sz w:val="24"/>
+          <w:szCs w:val="24"/>
+        </w:rPr>
+        <w:t>Orphan Job Recovery:</w:t>
+      </w:r>
+      <w:r>
+        <w:rPr>
+          <w:rFonts w:asciiTheme="majorHAnsi" w:hAnsiTheme="majorHAnsi" w:cstheme="majorHAnsi"/>
+          <w:sz w:val="24"/>
+          <w:szCs w:val="24"/>
+        </w:rPr>
+        <w:t xml:space="preserve"> A watchdog </w:t>
+      </w:r>
+      <w:proofErr w:type="spellStart"/>
+      <w:r>
+        <w:rPr>
+          <w:rFonts w:asciiTheme="majorHAnsi" w:hAnsiTheme="majorHAnsi" w:cstheme="majorHAnsi"/>
+          <w:sz w:val="24"/>
+          <w:szCs w:val="24"/>
+        </w:rPr>
+        <w:t>cron</w:t>
+      </w:r>
+      <w:proofErr w:type="spellEnd"/>
+      <w:r>
+        <w:rPr>
+          <w:rFonts w:asciiTheme="majorHAnsi" w:hAnsiTheme="majorHAnsi" w:cstheme="majorHAnsi"/>
+          <w:sz w:val="24"/>
+          <w:szCs w:val="24"/>
+        </w:rPr>
+        <w:t xml:space="preserve"> job checks for jobs stuck in the 'RUNNING' state past their lock timeout and requeues them automatically.</w:t>
       </w:r>
     </w:p>
     <w:p>
@@ -382,36 +804,82 @@
           <w:ilvl w:val="0"/>
           <w:numId w:val="3"/>
         </w:numPr>
-        <w:spacing w:lineRule="auto"/>
-      </w:pPr>
-      <w:r>
-        <w:rPr>
+        <w:rPr>
+          <w:rFonts w:asciiTheme="majorHAnsi" w:hAnsiTheme="majorHAnsi" w:cstheme="majorHAnsi"/>
+          <w:sz w:val="24"/>
+          <w:szCs w:val="24"/>
+        </w:rPr>
+      </w:pPr>
+      <w:r>
+        <w:rPr>
+          <w:rFonts w:asciiTheme="majorHAnsi" w:hAnsiTheme="majorHAnsi" w:cstheme="majorHAnsi"/>
           <w:b/>
-        </w:rPr>
-        <w:t xml:space="preserve">Idempotency:</w:t>
-      </w:r>
-      <w:r>
-        <w:rPr/>
+          <w:sz w:val="24"/>
+          <w:szCs w:val="24"/>
+        </w:rPr>
+        <w:t>Idempotency:</w:t>
+      </w:r>
+      <w:r>
+        <w:rPr>
+          <w:rFonts w:asciiTheme="majorHAnsi" w:hAnsiTheme="majorHAnsi" w:cstheme="majorHAnsi"/>
+          <w:sz w:val="24"/>
+          <w:szCs w:val="24"/>
+        </w:rPr>
         <w:t xml:space="preserve"> Clients provide an idempotency key to prevent duplicate job creation.</w:t>
       </w:r>
     </w:p>
     <w:p>
       <w:pPr>
+        <w:rPr>
+          <w:rFonts w:asciiTheme="majorHAnsi" w:hAnsiTheme="majorHAnsi" w:cstheme="majorHAnsi"/>
+          <w:b/>
+          <w:sz w:val="24"/>
+          <w:szCs w:val="24"/>
+        </w:rPr>
+      </w:pPr>
+      <w:r>
+        <w:rPr>
+          <w:rFonts w:asciiTheme="majorHAnsi" w:hAnsiTheme="majorHAnsi" w:cstheme="majorHAnsi"/>
+          <w:sz w:val="24"/>
+          <w:szCs w:val="24"/>
+        </w:rPr>
+        <w:br w:type="page"/>
+      </w:r>
+    </w:p>
+    <w:p>
+      <w:pPr>
         <w:pStyle w:val="Heading2"/>
-        <w:spacing w:lineRule="auto"/>
-      </w:pPr>
-      <w:r>
-        <w:rPr/>
-        <w:t xml:space="preserve">6. API Design</w:t>
-      </w:r>
-    </w:p>
-    <w:p>
-      <w:pPr>
-        <w:spacing w:lineRule="auto"/>
-      </w:pPr>
-      <w:r>
-        <w:rPr/>
-        <w:t xml:space="preserve">The REST API exposes the following core endpoints:</w:t>
+        <w:rPr>
+          <w:rFonts w:asciiTheme="majorHAnsi" w:hAnsiTheme="majorHAnsi" w:cstheme="majorHAnsi"/>
+          <w:sz w:val="24"/>
+          <w:szCs w:val="24"/>
+        </w:rPr>
+      </w:pPr>
+      <w:r>
+        <w:rPr>
+          <w:rFonts w:asciiTheme="majorHAnsi" w:hAnsiTheme="majorHAnsi" w:cstheme="majorHAnsi"/>
+          <w:sz w:val="24"/>
+          <w:szCs w:val="24"/>
+        </w:rPr>
+        <w:lastRenderedPageBreak/>
+        <w:t>6. API Design</w:t>
+      </w:r>
+    </w:p>
+    <w:p>
+      <w:pPr>
+        <w:rPr>
+          <w:rFonts w:asciiTheme="majorHAnsi" w:hAnsiTheme="majorHAnsi" w:cstheme="majorHAnsi"/>
+          <w:sz w:val="24"/>
+          <w:szCs w:val="24"/>
+        </w:rPr>
+      </w:pPr>
+      <w:r>
+        <w:rPr>
+          <w:rFonts w:asciiTheme="majorHAnsi" w:hAnsiTheme="majorHAnsi" w:cstheme="majorHAnsi"/>
+          <w:sz w:val="24"/>
+          <w:szCs w:val="24"/>
+        </w:rPr>
+        <w:t>The REST API exposes the following core endpoints:</w:t>
       </w:r>
     </w:p>
     <w:p>
@@ -420,15 +888,37 @@
           <w:ilvl w:val="0"/>
           <w:numId w:val="4"/>
         </w:numPr>
-        <w:spacing w:lineRule="auto"/>
-      </w:pPr>
-      <w:r>
-        <w:rPr/>
-        <w:t xml:space="preserve">POST /api/v1/projects/:id/queues</w:t>
-      </w:r>
-      <w:r>
-        <w:rPr/>
-        <w:t xml:space="preserve"> - Create a new queue.</w:t>
+        <w:rPr>
+          <w:rFonts w:asciiTheme="majorHAnsi" w:hAnsiTheme="majorHAnsi" w:cstheme="majorHAnsi"/>
+          <w:sz w:val="24"/>
+          <w:szCs w:val="24"/>
+        </w:rPr>
+      </w:pPr>
+      <w:r>
+        <w:rPr>
+          <w:rFonts w:asciiTheme="majorHAnsi" w:hAnsiTheme="majorHAnsi" w:cstheme="majorHAnsi"/>
+          <w:sz w:val="24"/>
+          <w:szCs w:val="24"/>
+        </w:rPr>
+        <w:t>POST /</w:t>
+      </w:r>
+      <w:proofErr w:type="spellStart"/>
+      <w:r>
+        <w:rPr>
+          <w:rFonts w:asciiTheme="majorHAnsi" w:hAnsiTheme="majorHAnsi" w:cstheme="majorHAnsi"/>
+          <w:sz w:val="24"/>
+          <w:szCs w:val="24"/>
+        </w:rPr>
+        <w:t>api</w:t>
+      </w:r>
+      <w:proofErr w:type="spellEnd"/>
+      <w:r>
+        <w:rPr>
+          <w:rFonts w:asciiTheme="majorHAnsi" w:hAnsiTheme="majorHAnsi" w:cstheme="majorHAnsi"/>
+          <w:sz w:val="24"/>
+          <w:szCs w:val="24"/>
+        </w:rPr>
+        <w:t>/v1/projects/:id/queues - Create a new queue.</w:t>
       </w:r>
     </w:p>
     <w:p>
@@ -437,15 +927,37 @@
           <w:ilvl w:val="0"/>
           <w:numId w:val="4"/>
         </w:numPr>
-        <w:spacing w:lineRule="auto"/>
-      </w:pPr>
-      <w:r>
-        <w:rPr/>
-        <w:t xml:space="preserve">POST /api/v1/queues/:id/jobs</w:t>
-      </w:r>
-      <w:r>
-        <w:rPr/>
-        <w:t xml:space="preserve"> - Enqueue a job.</w:t>
+        <w:rPr>
+          <w:rFonts w:asciiTheme="majorHAnsi" w:hAnsiTheme="majorHAnsi" w:cstheme="majorHAnsi"/>
+          <w:sz w:val="24"/>
+          <w:szCs w:val="24"/>
+        </w:rPr>
+      </w:pPr>
+      <w:r>
+        <w:rPr>
+          <w:rFonts w:asciiTheme="majorHAnsi" w:hAnsiTheme="majorHAnsi" w:cstheme="majorHAnsi"/>
+          <w:sz w:val="24"/>
+          <w:szCs w:val="24"/>
+        </w:rPr>
+        <w:t>POST /</w:t>
+      </w:r>
+      <w:proofErr w:type="spellStart"/>
+      <w:r>
+        <w:rPr>
+          <w:rFonts w:asciiTheme="majorHAnsi" w:hAnsiTheme="majorHAnsi" w:cstheme="majorHAnsi"/>
+          <w:sz w:val="24"/>
+          <w:szCs w:val="24"/>
+        </w:rPr>
+        <w:t>api</w:t>
+      </w:r>
+      <w:proofErr w:type="spellEnd"/>
+      <w:r>
+        <w:rPr>
+          <w:rFonts w:asciiTheme="majorHAnsi" w:hAnsiTheme="majorHAnsi" w:cstheme="majorHAnsi"/>
+          <w:sz w:val="24"/>
+          <w:szCs w:val="24"/>
+        </w:rPr>
+        <w:t>/v1/queues/:id/jobs - Enqueue a job.</w:t>
       </w:r>
     </w:p>
     <w:p>
@@ -454,15 +966,55 @@
           <w:ilvl w:val="0"/>
           <w:numId w:val="4"/>
         </w:numPr>
-        <w:spacing w:lineRule="auto"/>
-      </w:pPr>
-      <w:r>
-        <w:rPr/>
-        <w:t xml:space="preserve">POST /api/v1/queues/:id/scheduled-jobs</w:t>
-      </w:r>
-      <w:r>
-        <w:rPr/>
-        <w:t xml:space="preserve"> - Enqueue a cron job.</w:t>
+        <w:rPr>
+          <w:rFonts w:asciiTheme="majorHAnsi" w:hAnsiTheme="majorHAnsi" w:cstheme="majorHAnsi"/>
+          <w:sz w:val="24"/>
+          <w:szCs w:val="24"/>
+        </w:rPr>
+      </w:pPr>
+      <w:r>
+        <w:rPr>
+          <w:rFonts w:asciiTheme="majorHAnsi" w:hAnsiTheme="majorHAnsi" w:cstheme="majorHAnsi"/>
+          <w:sz w:val="24"/>
+          <w:szCs w:val="24"/>
+        </w:rPr>
+        <w:t>POST /</w:t>
+      </w:r>
+      <w:proofErr w:type="spellStart"/>
+      <w:r>
+        <w:rPr>
+          <w:rFonts w:asciiTheme="majorHAnsi" w:hAnsiTheme="majorHAnsi" w:cstheme="majorHAnsi"/>
+          <w:sz w:val="24"/>
+          <w:szCs w:val="24"/>
+        </w:rPr>
+        <w:t>api</w:t>
+      </w:r>
+      <w:proofErr w:type="spellEnd"/>
+      <w:r>
+        <w:rPr>
+          <w:rFonts w:asciiTheme="majorHAnsi" w:hAnsiTheme="majorHAnsi" w:cstheme="majorHAnsi"/>
+          <w:sz w:val="24"/>
+          <w:szCs w:val="24"/>
+        </w:rPr>
+        <w:t xml:space="preserve">/v1/queues/:id/scheduled-jobs - Enqueue a </w:t>
+      </w:r>
+      <w:proofErr w:type="spellStart"/>
+      <w:r>
+        <w:rPr>
+          <w:rFonts w:asciiTheme="majorHAnsi" w:hAnsiTheme="majorHAnsi" w:cstheme="majorHAnsi"/>
+          <w:sz w:val="24"/>
+          <w:szCs w:val="24"/>
+        </w:rPr>
+        <w:t>cron</w:t>
+      </w:r>
+      <w:proofErr w:type="spellEnd"/>
+      <w:r>
+        <w:rPr>
+          <w:rFonts w:asciiTheme="majorHAnsi" w:hAnsiTheme="majorHAnsi" w:cstheme="majorHAnsi"/>
+          <w:sz w:val="24"/>
+          <w:szCs w:val="24"/>
+        </w:rPr>
+        <w:t xml:space="preserve"> job.</w:t>
       </w:r>
     </w:p>
     <w:p>
@@ -471,59 +1023,183 @@
           <w:ilvl w:val="0"/>
           <w:numId w:val="4"/>
         </w:numPr>
-        <w:spacing w:lineRule="auto"/>
-      </w:pPr>
-      <w:r>
-        <w:rPr/>
-        <w:t xml:space="preserve">GET /api/v1/jobs/:id</w:t>
-      </w:r>
-      <w:r>
-        <w:rPr/>
-        <w:t xml:space="preserve"> - Get job status.</w:t>
+        <w:rPr>
+          <w:rFonts w:asciiTheme="majorHAnsi" w:hAnsiTheme="majorHAnsi" w:cstheme="majorHAnsi"/>
+          <w:sz w:val="24"/>
+          <w:szCs w:val="24"/>
+        </w:rPr>
+      </w:pPr>
+      <w:r>
+        <w:rPr>
+          <w:rFonts w:asciiTheme="majorHAnsi" w:hAnsiTheme="majorHAnsi" w:cstheme="majorHAnsi"/>
+          <w:sz w:val="24"/>
+          <w:szCs w:val="24"/>
+        </w:rPr>
+        <w:t>GET /</w:t>
+      </w:r>
+      <w:proofErr w:type="spellStart"/>
+      <w:r>
+        <w:rPr>
+          <w:rFonts w:asciiTheme="majorHAnsi" w:hAnsiTheme="majorHAnsi" w:cstheme="majorHAnsi"/>
+          <w:sz w:val="24"/>
+          <w:szCs w:val="24"/>
+        </w:rPr>
+        <w:t>api</w:t>
+      </w:r>
+      <w:proofErr w:type="spellEnd"/>
+      <w:r>
+        <w:rPr>
+          <w:rFonts w:asciiTheme="majorHAnsi" w:hAnsiTheme="majorHAnsi" w:cstheme="majorHAnsi"/>
+          <w:sz w:val="24"/>
+          <w:szCs w:val="24"/>
+        </w:rPr>
+        <w:t>/v1/jobs/:id - Get job status.</w:t>
       </w:r>
     </w:p>
     <w:p>
       <w:pPr>
         <w:pStyle w:val="Heading2"/>
-        <w:spacing w:lineRule="auto"/>
-      </w:pPr>
-      <w:r>
-        <w:rPr/>
-        <w:t xml:space="preserve">7. Testing Strategy</w:t>
-      </w:r>
-    </w:p>
-    <w:p>
-      <w:pPr>
-        <w:spacing w:lineRule="auto"/>
-      </w:pPr>
-      <w:r>
-        <w:rPr/>
-        <w:t xml:space="preserve">I implemented Unit testing for individual services, Integration testing for database concurrency, and E2E testing for the API controllers using Jest and Supertest.</w:t>
-      </w:r>
-    </w:p>
+        <w:rPr>
+          <w:rFonts w:asciiTheme="majorHAnsi" w:hAnsiTheme="majorHAnsi" w:cstheme="majorHAnsi"/>
+          <w:sz w:val="24"/>
+          <w:szCs w:val="24"/>
+        </w:rPr>
+      </w:pPr>
+      <w:r>
+        <w:rPr>
+          <w:rFonts w:asciiTheme="majorHAnsi" w:hAnsiTheme="majorHAnsi" w:cstheme="majorHAnsi"/>
+          <w:sz w:val="24"/>
+          <w:szCs w:val="24"/>
+        </w:rPr>
+        <w:t>7. Testing Strategy</w:t>
+      </w:r>
+    </w:p>
+    <w:p>
+      <w:pPr>
+        <w:rPr>
+          <w:rFonts w:asciiTheme="majorHAnsi" w:hAnsiTheme="majorHAnsi" w:cstheme="majorHAnsi"/>
+          <w:sz w:val="24"/>
+          <w:szCs w:val="24"/>
+        </w:rPr>
+      </w:pPr>
+      <w:r>
+        <w:rPr>
+          <w:rFonts w:asciiTheme="majorHAnsi" w:hAnsiTheme="majorHAnsi" w:cstheme="majorHAnsi"/>
+          <w:sz w:val="24"/>
+          <w:szCs w:val="24"/>
+        </w:rPr>
+        <w:t xml:space="preserve">I implemented Unit testing for individual services, Integration testing for database concurrency, and E2E testing for the API controllers using Jest and </w:t>
+      </w:r>
+      <w:proofErr w:type="spellStart"/>
+      <w:r>
+        <w:rPr>
+          <w:rFonts w:asciiTheme="majorHAnsi" w:hAnsiTheme="majorHAnsi" w:cstheme="majorHAnsi"/>
+          <w:sz w:val="24"/>
+          <w:szCs w:val="24"/>
+        </w:rPr>
+        <w:t>Supertest</w:t>
+      </w:r>
+      <w:proofErr w:type="spellEnd"/>
+      <w:r>
+        <w:rPr>
+          <w:rFonts w:asciiTheme="majorHAnsi" w:hAnsiTheme="majorHAnsi" w:cstheme="majorHAnsi"/>
+          <w:sz w:val="24"/>
+          <w:szCs w:val="24"/>
+        </w:rPr>
+        <w:t>.</w:t>
+      </w:r>
+    </w:p>
+    <w:sectPr>
+      <w:footerReference w:type="default" r:id="rId10"/>
+      <w:pgSz w:w="12240" w:h="15840"/>
+      <w:pgMar w:top="873" w:right="873" w:bottom="873" w:left="873" w:header="720" w:footer="720" w:gutter="0"/>
+      <w:cols w:space="720"/>
+    </w:sectPr>
   </w:body>
 </w:document>
 </file>
 
+<file path=word/endnotes.xml><?xml version="1.0" encoding="utf-8"?>
+<w:endnotes xmlns:wpc="http://schemas.microsoft.com/office/word/2010/wordprocessingCanvas" xmlns:cx="http://schemas.microsoft.com/office/drawing/2014/chartex" xmlns:cx1="http://schemas.microsoft.com/office/drawing/2015/9/8/chartex" xmlns:cx2="http://schemas.microsoft.com/office/drawing/2015/10/21/chartex" xmlns:cx3="http://schemas.microsoft.com/office/drawing/2016/5/9/chartex" xmlns:cx4="http://schemas.microsoft.com/office/drawing/2016/5/10/chartex" xmlns:cx5="http://schemas.microsoft.com/office/drawing/2016/5/11/chartex" xmlns:cx6="http://schemas.microsoft.com/office/drawing/2016/5/12/chartex" xmlns:cx7="http://schemas.microsoft.com/office/drawing/2016/5/13/chartex" xmlns:cx8="http://schemas.microsoft.com/office/drawing/2016/5/14/chartex" xmlns:mc="http://schemas.openxmlformats.org/markup-compatibility/2006" xmlns:aink="http://schemas.microsoft.com/office/drawing/2016/ink" xmlns:am3d="http://schemas.microsoft.com/office/drawing/2017/model3d" xmlns:o="urn:schemas-microsoft-com:office:office" xmlns:oel="http://schemas.microsoft.com/office/2019/extlst" xmlns:r="http://schemas.openxmlformats.org/officeDocument/2006/relationships" xmlns:m="http://schemas.openxmlformats.org/officeDocument/2006/math" xmlns:v="urn:schemas-microsoft-com:vml" xmlns:wp14="http://schemas.microsoft.com/office/word/2010/wordprocessingDrawing" xmlns:wp="http://schemas.openxmlformats.org/drawingml/2006/wordprocessingDrawing" xmlns:w10="urn:schemas-microsoft-com:office:word" xmlns:w="http://schemas.openxmlformats.org/wordprocessingml/2006/main" xmlns:w14="http://schemas.microsoft.com/office/word/2010/wordml" xmlns:w15="http://schemas.microsoft.com/office/word/2012/wordml" xmlns:w16cex="http://schemas.microsoft.com/office/word/2018/wordml/cex" xmlns:w16cid="http://schemas.microsoft.com/office/word/2016/wordml/cid" xmlns:w16="http://schemas.microsoft.com/office/word/2018/wordml" xmlns:w16du="http://schemas.microsoft.com/office/word/2023/wordml/word16du" xmlns:w16sdtdh="http://schemas.microsoft.com/office/word/2020/wordml/sdtdatahash" xmlns:w16sdtfl="http://schemas.microsoft.com/office/word/2024/wordml/sdtformatlock" xmlns:w16se="http://schemas.microsoft.com/office/word/2015/wordml/symex" xmlns:wpg="http://schemas.microsoft.com/office/word/2010/wordprocessingGroup" xmlns:wpi="http://schemas.microsoft.com/office/word/2010/wordprocessingInk" xmlns:wne="http://schemas.microsoft.com/office/word/2006/wordml" xmlns:wps="http://schemas.microsoft.com/office/word/2010/wordprocessingShape" mc:Ignorable="w14 w15 w16se w16cid w16 w16cex w16sdtdh w16sdtfl w16du wp14">
+  <w:endnote w:type="separator" w:id="-1">
+    <w:p>
+      <w:pPr>
+        <w:spacing w:after="0" w:line="240" w:lineRule="auto"/>
+      </w:pPr>
+      <w:r>
+        <w:separator/>
+      </w:r>
+    </w:p>
+  </w:endnote>
+  <w:endnote w:type="continuationSeparator" w:id="0">
+    <w:p>
+      <w:pPr>
+        <w:spacing w:after="0" w:line="240" w:lineRule="auto"/>
+      </w:pPr>
+      <w:r>
+        <w:continuationSeparator/>
+      </w:r>
+    </w:p>
+  </w:endnote>
+</w:endnotes>
+</file>
+
 <file path=word/footer1.xml><?xml version="1.0" encoding="utf-8"?>
-<ftr xmlns="http://schemas.openxmlformats.org/wordprocessingml/2006/main">
-  <p>
-    <pPr>
-      <spacing xmlns:ns1="http://schemas.openxmlformats.org/wordprocessingml/2006/main" ns1:lineRule="auto"/>
-    </pPr>
-    <r>
-      <rPr/>
-    </r>
-    <fldSimple xmlns:ns2="http://schemas.openxmlformats.org/wordprocessingml/2006/main" ns2:instr="PAGE">
-      <r/>
-    </fldSimple>
-  </p>
-</ftr>
+<w:ftr xmlns:wpc="http://schemas.microsoft.com/office/word/2010/wordprocessingCanvas" xmlns:cx="http://schemas.microsoft.com/office/drawing/2014/chartex" xmlns:cx1="http://schemas.microsoft.com/office/drawing/2015/9/8/chartex" xmlns:cx2="http://schemas.microsoft.com/office/drawing/2015/10/21/chartex" xmlns:cx3="http://schemas.microsoft.com/office/drawing/2016/5/9/chartex" xmlns:cx4="http://schemas.microsoft.com/office/drawing/2016/5/10/chartex" xmlns:cx5="http://schemas.microsoft.com/office/drawing/2016/5/11/chartex" xmlns:cx6="http://schemas.microsoft.com/office/drawing/2016/5/12/chartex" xmlns:cx7="http://schemas.microsoft.com/office/drawing/2016/5/13/chartex" xmlns:cx8="http://schemas.microsoft.com/office/drawing/2016/5/14/chartex" xmlns:mc="http://schemas.openxmlformats.org/markup-compatibility/2006" xmlns:aink="http://schemas.microsoft.com/office/drawing/2016/ink" xmlns:am3d="http://schemas.microsoft.com/office/drawing/2017/model3d" xmlns:o="urn:schemas-microsoft-com:office:office" xmlns:oel="http://schemas.microsoft.com/office/2019/extlst" xmlns:r="http://schemas.openxmlformats.org/officeDocument/2006/relationships" xmlns:m="http://schemas.openxmlformats.org/officeDocument/2006/math" xmlns:v="urn:schemas-microsoft-com:vml" xmlns:wp14="http://schemas.microsoft.com/office/word/2010/wordprocessingDrawing" xmlns:wp="http://schemas.openxmlformats.org/drawingml/2006/wordprocessingDrawing" xmlns:w10="urn:schemas-microsoft-com:office:word" xmlns:w="http://schemas.openxmlformats.org/wordprocessingml/2006/main" xmlns:w14="http://schemas.microsoft.com/office/word/2010/wordml" xmlns:w15="http://schemas.microsoft.com/office/word/2012/wordml" xmlns:w16cex="http://schemas.microsoft.com/office/word/2018/wordml/cex" xmlns:w16cid="http://schemas.microsoft.com/office/word/2016/wordml/cid" xmlns:w16="http://schemas.microsoft.com/office/word/2018/wordml" xmlns:w16du="http://schemas.microsoft.com/office/word/2023/wordml/word16du" xmlns:w16sdtdh="http://schemas.microsoft.com/office/word/2020/wordml/sdtdatahash" xmlns:w16sdtfl="http://schemas.microsoft.com/office/word/2024/wordml/sdtformatlock" xmlns:w16se="http://schemas.microsoft.com/office/word/2015/wordml/symex" xmlns:wpg="http://schemas.microsoft.com/office/word/2010/wordprocessingGroup" xmlns:wpi="http://schemas.microsoft.com/office/word/2010/wordprocessingInk" xmlns:wne="http://schemas.microsoft.com/office/word/2006/wordml" xmlns:wps="http://schemas.microsoft.com/office/word/2010/wordprocessingShape" mc:Ignorable="w14 w15 w16se w16cid w16 w16cex w16sdtdh w16sdtfl w16du wp14">
+  <w:p>
+    <w:r>
+      <w:fldChar w:fldCharType="begin"/>
+    </w:r>
+    <w:r>
+      <w:instrText>PAGE</w:instrText>
+    </w:r>
+    <w:r>
+      <w:fldChar w:fldCharType="separate"/>
+    </w:r>
+    <w:r>
+      <w:rPr>
+        <w:noProof/>
+      </w:rPr>
+      <w:t>1</w:t>
+    </w:r>
+    <w:r>
+      <w:fldChar w:fldCharType="end"/>
+    </w:r>
+  </w:p>
+</w:ftr>
+</file>
+
+<file path=word/footnotes.xml><?xml version="1.0" encoding="utf-8"?>
+<w:footnotes xmlns:wpc="http://schemas.microsoft.com/office/word/2010/wordprocessingCanvas" xmlns:cx="http://schemas.microsoft.com/office/drawing/2014/chartex" xmlns:cx1="http://schemas.microsoft.com/office/drawing/2015/9/8/chartex" xmlns:cx2="http://schemas.microsoft.com/office/drawing/2015/10/21/chartex" xmlns:cx3="http://schemas.microsoft.com/office/drawing/2016/5/9/chartex" xmlns:cx4="http://schemas.microsoft.com/office/drawing/2016/5/10/chartex" xmlns:cx5="http://schemas.microsoft.com/office/drawing/2016/5/11/chartex" xmlns:cx6="http://schemas.microsoft.com/office/drawing/2016/5/12/chartex" xmlns:cx7="http://schemas.microsoft.com/office/drawing/2016/5/13/chartex" xmlns:cx8="http://schemas.microsoft.com/office/drawing/2016/5/14/chartex" xmlns:mc="http://schemas.openxmlformats.org/markup-compatibility/2006" xmlns:aink="http://schemas.microsoft.com/office/drawing/2016/ink" xmlns:am3d="http://schemas.microsoft.com/office/drawing/2017/model3d" xmlns:o="urn:schemas-microsoft-com:office:office" xmlns:oel="http://schemas.microsoft.com/office/2019/extlst" xmlns:r="http://schemas.openxmlformats.org/officeDocument/2006/relationships" xmlns:m="http://schemas.openxmlformats.org/officeDocument/2006/math" xmlns:v="urn:schemas-microsoft-com:vml" xmlns:wp14="http://schemas.microsoft.com/office/word/2010/wordprocessingDrawing" xmlns:wp="http://schemas.openxmlformats.org/drawingml/2006/wordprocessingDrawing" xmlns:w10="urn:schemas-microsoft-com:office:word" xmlns:w="http://schemas.openxmlformats.org/wordprocessingml/2006/main" xmlns:w14="http://schemas.microsoft.com/office/word/2010/wordml" xmlns:w15="http://schemas.microsoft.com/office/word/2012/wordml" xmlns:w16cex="http://schemas.microsoft.com/office/word/2018/wordml/cex" xmlns:w16cid="http://schemas.microsoft.com/office/word/2016/wordml/cid" xmlns:w16="http://schemas.microsoft.com/office/word/2018/wordml" xmlns:w16du="http://schemas.microsoft.com/office/word/2023/wordml/word16du" xmlns:w16sdtdh="http://schemas.microsoft.com/office/word/2020/wordml/sdtdatahash" xmlns:w16sdtfl="http://schemas.microsoft.com/office/word/2024/wordml/sdtformatlock" xmlns:w16se="http://schemas.microsoft.com/office/word/2015/wordml/symex" xmlns:wpg="http://schemas.microsoft.com/office/word/2010/wordprocessingGroup" xmlns:wpi="http://schemas.microsoft.com/office/word/2010/wordprocessingInk" xmlns:wne="http://schemas.microsoft.com/office/word/2006/wordml" xmlns:wps="http://schemas.microsoft.com/office/word/2010/wordprocessingShape" mc:Ignorable="w14 w15 w16se w16cid w16 w16cex w16sdtdh w16sdtfl w16du wp14">
+  <w:footnote w:type="separator" w:id="-1">
+    <w:p>
+      <w:pPr>
+        <w:spacing w:after="0" w:line="240" w:lineRule="auto"/>
+      </w:pPr>
+      <w:r>
+        <w:separator/>
+      </w:r>
+    </w:p>
+  </w:footnote>
+  <w:footnote w:type="continuationSeparator" w:id="0">
+    <w:p>
+      <w:pPr>
+        <w:spacing w:after="0" w:line="240" w:lineRule="auto"/>
+      </w:pPr>
+      <w:r>
+        <w:continuationSeparator/>
+      </w:r>
+    </w:p>
+  </w:footnote>
+</w:footnotes>
 </file>
 
 <file path=word/numbering.xml><?xml version="1.0" encoding="utf-8"?>
-<w:numbering xmlns:w="http://schemas.openxmlformats.org/wordprocessingml/2006/main" xmlns:ve="http://schemas.openxmlformats.org/markup-compatibility/2006" xmlns:o="urn:schemas-microsoft-com:office:office" xmlns:r="http://schemas.openxmlformats.org/officeDocument/2006/relationships" xmlns:v="urn:schemas-microsoft-com:vml" xmlns:wp="http://schemas.openxmlformats.org/drawingml/2006/wordprocessingDrawing" xmlns:w10="urn:schemas-microsoft-com:office:word" xmlns:wne="http://schemas.microsoft.com/office/word/2006/wordml">
-  <w:abstractNum w:abstractNumId="1">
+<w:numbering xmlns:wpc="http://schemas.microsoft.com/office/word/2010/wordprocessingCanvas" xmlns:cx="http://schemas.microsoft.com/office/drawing/2014/chartex" xmlns:cx1="http://schemas.microsoft.com/office/drawing/2015/9/8/chartex" xmlns:cx2="http://schemas.microsoft.com/office/drawing/2015/10/21/chartex" xmlns:cx3="http://schemas.microsoft.com/office/drawing/2016/5/9/chartex" xmlns:cx4="http://schemas.microsoft.com/office/drawing/2016/5/10/chartex" xmlns:cx5="http://schemas.microsoft.com/office/drawing/2016/5/11/chartex" xmlns:cx6="http://schemas.microsoft.com/office/drawing/2016/5/12/chartex" xmlns:cx7="http://schemas.microsoft.com/office/drawing/2016/5/13/chartex" xmlns:cx8="http://schemas.microsoft.com/office/drawing/2016/5/14/chartex" xmlns:mc="http://schemas.openxmlformats.org/markup-compatibility/2006" xmlns:aink="http://schemas.microsoft.com/office/drawing/2016/ink" xmlns:am3d="http://schemas.microsoft.com/office/drawing/2017/model3d" xmlns:o="urn:schemas-microsoft-com:office:office" xmlns:oel="http://schemas.microsoft.com/office/2019/extlst" xmlns:r="http://schemas.openxmlformats.org/officeDocument/2006/relationships" xmlns:m="http://schemas.openxmlformats.org/officeDocument/2006/math" xmlns:v="urn:schemas-microsoft-com:vml" xmlns:wp14="http://schemas.microsoft.com/office/word/2010/wordprocessingDrawing" xmlns:wp="http://schemas.openxmlformats.org/drawingml/2006/wordprocessingDrawing" xmlns:w10="urn:schemas-microsoft-com:office:word" xmlns:w="http://schemas.openxmlformats.org/wordprocessingml/2006/main" xmlns:w14="http://schemas.microsoft.com/office/word/2010/wordml" xmlns:w15="http://schemas.microsoft.com/office/word/2012/wordml" xmlns:w16cex="http://schemas.microsoft.com/office/word/2018/wordml/cex" xmlns:w16cid="http://schemas.microsoft.com/office/word/2016/wordml/cid" xmlns:w16="http://schemas.microsoft.com/office/word/2018/wordml" xmlns:w16du="http://schemas.microsoft.com/office/word/2023/wordml/word16du" xmlns:w16sdtdh="http://schemas.microsoft.com/office/word/2020/wordml/sdtdatahash" xmlns:w16sdtfl="http://schemas.microsoft.com/office/word/2024/wordml/sdtformatlock" xmlns:w16se="http://schemas.microsoft.com/office/word/2015/wordml/symex" xmlns:wpg="http://schemas.microsoft.com/office/word/2010/wordprocessingGroup" xmlns:wpi="http://schemas.microsoft.com/office/word/2010/wordprocessingInk" xmlns:wne="http://schemas.microsoft.com/office/word/2006/wordml" xmlns:wps="http://schemas.microsoft.com/office/word/2010/wordprocessingShape" mc:Ignorable="w14 w15 w16se w16cid w16 w16cex w16sdtdh w16sdtfl w16du wp14">
+  <w:abstractNum w:abstractNumId="0" w15:restartNumberingAfterBreak="0">
+    <w:nsid w:val="18924876"/>
+    <w:multiLevelType w:val="multilevel"/>
+    <w:tmpl w:val="BB34634E"/>
     <w:lvl w:ilvl="0">
       <w:start w:val="1"/>
       <w:numFmt w:val="bullet"/>
@@ -644,8 +1320,16 @@
         <w:rFonts w:ascii="Symbol" w:hAnsi="Symbol" w:hint="default"/>
       </w:rPr>
     </w:lvl>
+    <w:lvl w:ilvl="8">
+      <w:numFmt w:val="decimal"/>
+      <w:lvlText w:val=""/>
+      <w:lvlJc w:val="left"/>
+    </w:lvl>
   </w:abstractNum>
-  <w:abstractNum w:abstractNumId="2">
+  <w:abstractNum w:abstractNumId="1" w15:restartNumberingAfterBreak="0">
+    <w:nsid w:val="31F11CBC"/>
+    <w:multiLevelType w:val="multilevel"/>
+    <w:tmpl w:val="0D3C287A"/>
     <w:lvl w:ilvl="0">
       <w:start w:val="1"/>
       <w:numFmt w:val="bullet"/>
@@ -766,8 +1450,16 @@
         <w:rFonts w:ascii="Symbol" w:hAnsi="Symbol" w:hint="default"/>
       </w:rPr>
     </w:lvl>
+    <w:lvl w:ilvl="8">
+      <w:numFmt w:val="decimal"/>
+      <w:lvlText w:val=""/>
+      <w:lvlJc w:val="left"/>
+    </w:lvl>
   </w:abstractNum>
-  <w:abstractNum w:abstractNumId="3">
+  <w:abstractNum w:abstractNumId="2" w15:restartNumberingAfterBreak="0">
+    <w:nsid w:val="7DDE78D2"/>
+    <w:multiLevelType w:val="multilevel"/>
+    <w:tmpl w:val="D87242AE"/>
     <w:lvl w:ilvl="0">
       <w:start w:val="1"/>
       <w:numFmt w:val="bullet"/>
@@ -888,8 +1580,16 @@
         <w:rFonts w:ascii="Symbol" w:hAnsi="Symbol" w:hint="default"/>
       </w:rPr>
     </w:lvl>
+    <w:lvl w:ilvl="8">
+      <w:numFmt w:val="decimal"/>
+      <w:lvlText w:val=""/>
+      <w:lvlJc w:val="left"/>
+    </w:lvl>
   </w:abstractNum>
-  <w:abstractNum w:abstractNumId="4">
+  <w:abstractNum w:abstractNumId="3" w15:restartNumberingAfterBreak="0">
+    <w:nsid w:val="7F0D7D09"/>
+    <w:multiLevelType w:val="multilevel"/>
+    <w:tmpl w:val="33B4E8F6"/>
     <w:lvl w:ilvl="0">
       <w:start w:val="1"/>
       <w:numFmt w:val="bullet"/>
@@ -1010,24 +1710,29 @@
         <w:rFonts w:ascii="Symbol" w:hAnsi="Symbol" w:hint="default"/>
       </w:rPr>
     </w:lvl>
+    <w:lvl w:ilvl="8">
+      <w:numFmt w:val="decimal"/>
+      <w:lvlText w:val=""/>
+      <w:lvlJc w:val="left"/>
+    </w:lvl>
   </w:abstractNum>
-  <w:num w:numId="1">
+  <w:num w:numId="1" w16cid:durableId="237372326">
+    <w:abstractNumId w:val="0"/>
+  </w:num>
+  <w:num w:numId="2" w16cid:durableId="1059784165">
     <w:abstractNumId w:val="1"/>
   </w:num>
-  <w:num w:numId="2">
+  <w:num w:numId="3" w16cid:durableId="909078466">
     <w:abstractNumId w:val="2"/>
   </w:num>
-  <w:num w:numId="3">
+  <w:num w:numId="4" w16cid:durableId="701979168">
     <w:abstractNumId w:val="3"/>
-  </w:num>
-  <w:num w:numId="4">
-    <w:abstractNumId w:val="4"/>
   </w:num>
 </w:numbering>
 </file>
 
 <file path=word/styles.xml><?xml version="1.0" encoding="utf-8"?>
-<w:styles xmlns:w="http://schemas.openxmlformats.org/wordprocessingml/2006/main" xmlns:r="http://schemas.openxmlformats.org/officeDocument/2006/relationships">
+<w:styles xmlns:mc="http://schemas.openxmlformats.org/markup-compatibility/2006" xmlns:r="http://schemas.openxmlformats.org/officeDocument/2006/relationships" xmlns:w="http://schemas.openxmlformats.org/wordprocessingml/2006/main" xmlns:w14="http://schemas.microsoft.com/office/word/2010/wordml" xmlns:w15="http://schemas.microsoft.com/office/word/2012/wordml" xmlns:w16cex="http://schemas.microsoft.com/office/word/2018/wordml/cex" xmlns:w16cid="http://schemas.microsoft.com/office/word/2016/wordml/cid" xmlns:w16="http://schemas.microsoft.com/office/word/2018/wordml" xmlns:w16du="http://schemas.microsoft.com/office/word/2023/wordml/word16du" xmlns:w16sdtdh="http://schemas.microsoft.com/office/word/2020/wordml/sdtdatahash" xmlns:w16sdtfl="http://schemas.microsoft.com/office/word/2024/wordml/sdtformatlock" xmlns:w16se="http://schemas.microsoft.com/office/word/2015/wordml/symex" mc:Ignorable="w14 w15 w16se w16cid w16 w16cex w16sdtdh w16sdtfl w16du">
   <w:docDefaults>
     <w:rPrDefault>
       <w:rPr>
@@ -1043,17 +1748,390 @@
       </w:pPr>
     </w:pPrDefault>
   </w:docDefaults>
-  <w:style w:type="character" w:styleId="Hyperlink">
-    <w:name w:val="Hyperlink"/>
-    <w:rPr>
-      <w:color w:val="0000FF"/>
-      <w:u w:val="single"/>
-    </w:rPr>
+  <w:latentStyles w:defLockedState="0" w:defUIPriority="99" w:defSemiHidden="0" w:defUnhideWhenUsed="0" w:defQFormat="0" w:count="376">
+    <w:lsdException w:name="Normal" w:uiPriority="0" w:qFormat="1"/>
+    <w:lsdException w:name="heading 1" w:uiPriority="9" w:qFormat="1"/>
+    <w:lsdException w:name="heading 2" w:semiHidden="1" w:uiPriority="9" w:unhideWhenUsed="1" w:qFormat="1"/>
+    <w:lsdException w:name="heading 3" w:semiHidden="1" w:uiPriority="9" w:unhideWhenUsed="1" w:qFormat="1"/>
+    <w:lsdException w:name="heading 4" w:semiHidden="1" w:uiPriority="9" w:unhideWhenUsed="1" w:qFormat="1"/>
+    <w:lsdException w:name="heading 5" w:semiHidden="1" w:uiPriority="9" w:unhideWhenUsed="1" w:qFormat="1"/>
+    <w:lsdException w:name="heading 6" w:semiHidden="1" w:uiPriority="9" w:unhideWhenUsed="1" w:qFormat="1"/>
+    <w:lsdException w:name="heading 7" w:semiHidden="1" w:uiPriority="9" w:unhideWhenUsed="1" w:qFormat="1"/>
+    <w:lsdException w:name="heading 8" w:semiHidden="1" w:uiPriority="9" w:unhideWhenUsed="1" w:qFormat="1"/>
+    <w:lsdException w:name="heading 9" w:semiHidden="1" w:uiPriority="9" w:unhideWhenUsed="1" w:qFormat="1"/>
+    <w:lsdException w:name="index 1" w:semiHidden="1" w:unhideWhenUsed="1"/>
+    <w:lsdException w:name="index 2" w:semiHidden="1" w:unhideWhenUsed="1"/>
+    <w:lsdException w:name="index 3" w:semiHidden="1" w:unhideWhenUsed="1"/>
+    <w:lsdException w:name="index 4" w:semiHidden="1" w:unhideWhenUsed="1"/>
+    <w:lsdException w:name="index 5" w:semiHidden="1" w:unhideWhenUsed="1"/>
+    <w:lsdException w:name="index 6" w:semiHidden="1" w:unhideWhenUsed="1"/>
+    <w:lsdException w:name="index 7" w:semiHidden="1" w:unhideWhenUsed="1"/>
+    <w:lsdException w:name="index 8" w:semiHidden="1" w:unhideWhenUsed="1"/>
+    <w:lsdException w:name="index 9" w:semiHidden="1" w:unhideWhenUsed="1"/>
+    <w:lsdException w:name="toc 1" w:semiHidden="1" w:uiPriority="39" w:unhideWhenUsed="1"/>
+    <w:lsdException w:name="toc 2" w:semiHidden="1" w:uiPriority="39" w:unhideWhenUsed="1"/>
+    <w:lsdException w:name="toc 3" w:semiHidden="1" w:uiPriority="39" w:unhideWhenUsed="1"/>
+    <w:lsdException w:name="toc 4" w:semiHidden="1" w:uiPriority="39" w:unhideWhenUsed="1"/>
+    <w:lsdException w:name="toc 5" w:semiHidden="1" w:uiPriority="39" w:unhideWhenUsed="1"/>
+    <w:lsdException w:name="toc 6" w:semiHidden="1" w:uiPriority="39" w:unhideWhenUsed="1"/>
+    <w:lsdException w:name="toc 7" w:semiHidden="1" w:uiPriority="39" w:unhideWhenUsed="1"/>
+    <w:lsdException w:name="toc 8" w:semiHidden="1" w:uiPriority="39" w:unhideWhenUsed="1"/>
+    <w:lsdException w:name="toc 9" w:semiHidden="1" w:uiPriority="39" w:unhideWhenUsed="1"/>
+    <w:lsdException w:name="Normal Indent" w:semiHidden="1" w:unhideWhenUsed="1"/>
+    <w:lsdException w:name="footnote text" w:semiHidden="1" w:unhideWhenUsed="1"/>
+    <w:lsdException w:name="annotation text" w:semiHidden="1" w:unhideWhenUsed="1"/>
+    <w:lsdException w:name="header" w:semiHidden="1" w:unhideWhenUsed="1"/>
+    <w:lsdException w:name="footer" w:semiHidden="1" w:unhideWhenUsed="1"/>
+    <w:lsdException w:name="index heading" w:semiHidden="1" w:unhideWhenUsed="1"/>
+    <w:lsdException w:name="caption" w:semiHidden="1" w:uiPriority="35" w:unhideWhenUsed="1" w:qFormat="1"/>
+    <w:lsdException w:name="table of figures" w:semiHidden="1" w:unhideWhenUsed="1"/>
+    <w:lsdException w:name="envelope address" w:semiHidden="1" w:unhideWhenUsed="1"/>
+    <w:lsdException w:name="envelope return" w:semiHidden="1" w:unhideWhenUsed="1"/>
+    <w:lsdException w:name="footnote reference" w:semiHidden="1" w:unhideWhenUsed="1"/>
+    <w:lsdException w:name="annotation reference" w:semiHidden="1" w:unhideWhenUsed="1"/>
+    <w:lsdException w:name="line number" w:semiHidden="1" w:unhideWhenUsed="1"/>
+    <w:lsdException w:name="page number" w:semiHidden="1" w:unhideWhenUsed="1"/>
+    <w:lsdException w:name="endnote reference" w:semiHidden="1" w:unhideWhenUsed="1"/>
+    <w:lsdException w:name="endnote text" w:semiHidden="1" w:unhideWhenUsed="1"/>
+    <w:lsdException w:name="table of authorities" w:semiHidden="1" w:unhideWhenUsed="1"/>
+    <w:lsdException w:name="macro" w:semiHidden="1" w:unhideWhenUsed="1"/>
+    <w:lsdException w:name="toa heading" w:semiHidden="1" w:unhideWhenUsed="1"/>
+    <w:lsdException w:name="List" w:semiHidden="1" w:unhideWhenUsed="1"/>
+    <w:lsdException w:name="List Bullet" w:semiHidden="1" w:unhideWhenUsed="1"/>
+    <w:lsdException w:name="List Number" w:semiHidden="1" w:unhideWhenUsed="1"/>
+    <w:lsdException w:name="List 2" w:semiHidden="1" w:unhideWhenUsed="1"/>
+    <w:lsdException w:name="List 3" w:semiHidden="1" w:unhideWhenUsed="1"/>
+    <w:lsdException w:name="List 4" w:semiHidden="1" w:unhideWhenUsed="1"/>
+    <w:lsdException w:name="List 5" w:semiHidden="1" w:unhideWhenUsed="1"/>
+    <w:lsdException w:name="List Bullet 2" w:semiHidden="1" w:unhideWhenUsed="1"/>
+    <w:lsdException w:name="List Bullet 3" w:semiHidden="1" w:unhideWhenUsed="1"/>
+    <w:lsdException w:name="List Bullet 4" w:semiHidden="1" w:unhideWhenUsed="1"/>
+    <w:lsdException w:name="List Bullet 5" w:semiHidden="1" w:unhideWhenUsed="1"/>
+    <w:lsdException w:name="List Number 2" w:semiHidden="1" w:unhideWhenUsed="1"/>
+    <w:lsdException w:name="List Number 3" w:semiHidden="1" w:unhideWhenUsed="1"/>
+    <w:lsdException w:name="List Number 4" w:semiHidden="1" w:unhideWhenUsed="1"/>
+    <w:lsdException w:name="List Number 5" w:semiHidden="1" w:unhideWhenUsed="1"/>
+    <w:lsdException w:name="Title" w:uiPriority="10" w:qFormat="1"/>
+    <w:lsdException w:name="Closing" w:semiHidden="1" w:unhideWhenUsed="1"/>
+    <w:lsdException w:name="Signature" w:semiHidden="1" w:unhideWhenUsed="1"/>
+    <w:lsdException w:name="Default Paragraph Font" w:semiHidden="1" w:uiPriority="1" w:unhideWhenUsed="1"/>
+    <w:lsdException w:name="Body Text" w:semiHidden="1" w:unhideWhenUsed="1"/>
+    <w:lsdException w:name="Body Text Indent" w:semiHidden="1" w:unhideWhenUsed="1"/>
+    <w:lsdException w:name="List Continue" w:semiHidden="1" w:unhideWhenUsed="1"/>
+    <w:lsdException w:name="List Continue 2" w:semiHidden="1" w:unhideWhenUsed="1"/>
+    <w:lsdException w:name="List Continue 3" w:semiHidden="1" w:unhideWhenUsed="1"/>
+    <w:lsdException w:name="List Continue 4" w:semiHidden="1" w:unhideWhenUsed="1"/>
+    <w:lsdException w:name="List Continue 5" w:semiHidden="1" w:unhideWhenUsed="1"/>
+    <w:lsdException w:name="Message Header" w:semiHidden="1" w:unhideWhenUsed="1"/>
+    <w:lsdException w:name="Subtitle" w:uiPriority="11" w:qFormat="1"/>
+    <w:lsdException w:name="Salutation" w:semiHidden="1" w:unhideWhenUsed="1"/>
+    <w:lsdException w:name="Date" w:semiHidden="1" w:unhideWhenUsed="1"/>
+    <w:lsdException w:name="Body Text First Indent" w:semiHidden="1" w:unhideWhenUsed="1"/>
+    <w:lsdException w:name="Body Text First Indent 2" w:semiHidden="1" w:unhideWhenUsed="1"/>
+    <w:lsdException w:name="Note Heading" w:semiHidden="1" w:unhideWhenUsed="1"/>
+    <w:lsdException w:name="Body Text 2" w:semiHidden="1" w:unhideWhenUsed="1"/>
+    <w:lsdException w:name="Body Text 3" w:semiHidden="1" w:unhideWhenUsed="1"/>
+    <w:lsdException w:name="Body Text Indent 2" w:semiHidden="1" w:unhideWhenUsed="1"/>
+    <w:lsdException w:name="Body Text Indent 3" w:semiHidden="1" w:unhideWhenUsed="1"/>
+    <w:lsdException w:name="Block Text" w:semiHidden="1" w:unhideWhenUsed="1"/>
+    <w:lsdException w:name="Hyperlink" w:semiHidden="1" w:unhideWhenUsed="1"/>
+    <w:lsdException w:name="FollowedHyperlink" w:semiHidden="1" w:unhideWhenUsed="1"/>
+    <w:lsdException w:name="Strong" w:uiPriority="22" w:qFormat="1"/>
+    <w:lsdException w:name="Emphasis" w:uiPriority="20" w:qFormat="1"/>
+    <w:lsdException w:name="Document Map" w:semiHidden="1" w:unhideWhenUsed="1"/>
+    <w:lsdException w:name="Plain Text" w:semiHidden="1" w:unhideWhenUsed="1"/>
+    <w:lsdException w:name="E-mail Signature" w:semiHidden="1" w:unhideWhenUsed="1"/>
+    <w:lsdException w:name="HTML Top of Form" w:semiHidden="1" w:unhideWhenUsed="1"/>
+    <w:lsdException w:name="HTML Bottom of Form" w:semiHidden="1" w:unhideWhenUsed="1"/>
+    <w:lsdException w:name="Normal (Web)" w:semiHidden="1" w:unhideWhenUsed="1"/>
+    <w:lsdException w:name="HTML Acronym" w:semiHidden="1" w:unhideWhenUsed="1"/>
+    <w:lsdException w:name="HTML Address" w:semiHidden="1" w:unhideWhenUsed="1"/>
+    <w:lsdException w:name="HTML Cite" w:semiHidden="1" w:unhideWhenUsed="1"/>
+    <w:lsdException w:name="HTML Code" w:semiHidden="1" w:unhideWhenUsed="1"/>
+    <w:lsdException w:name="HTML Definition" w:semiHidden="1" w:unhideWhenUsed="1"/>
+    <w:lsdException w:name="HTML Keyboard" w:semiHidden="1" w:unhideWhenUsed="1"/>
+    <w:lsdException w:name="HTML Preformatted" w:semiHidden="1" w:unhideWhenUsed="1"/>
+    <w:lsdException w:name="HTML Sample" w:semiHidden="1" w:unhideWhenUsed="1"/>
+    <w:lsdException w:name="HTML Typewriter" w:semiHidden="1" w:unhideWhenUsed="1"/>
+    <w:lsdException w:name="HTML Variable" w:semiHidden="1" w:unhideWhenUsed="1"/>
+    <w:lsdException w:name="Normal Table" w:semiHidden="1" w:unhideWhenUsed="1"/>
+    <w:lsdException w:name="annotation subject" w:semiHidden="1" w:unhideWhenUsed="1"/>
+    <w:lsdException w:name="No List" w:semiHidden="1" w:unhideWhenUsed="1"/>
+    <w:lsdException w:name="Outline List 1" w:semiHidden="1" w:unhideWhenUsed="1"/>
+    <w:lsdException w:name="Outline List 2" w:semiHidden="1" w:unhideWhenUsed="1"/>
+    <w:lsdException w:name="Outline List 3" w:semiHidden="1" w:unhideWhenUsed="1"/>
+    <w:lsdException w:name="Table Simple 1" w:semiHidden="1" w:unhideWhenUsed="1"/>
+    <w:lsdException w:name="Table Simple 2" w:semiHidden="1" w:unhideWhenUsed="1"/>
+    <w:lsdException w:name="Table Simple 3" w:semiHidden="1" w:unhideWhenUsed="1"/>
+    <w:lsdException w:name="Table Classic 1" w:semiHidden="1" w:unhideWhenUsed="1"/>
+    <w:lsdException w:name="Table Classic 2" w:semiHidden="1" w:unhideWhenUsed="1"/>
+    <w:lsdException w:name="Table Classic 3" w:semiHidden="1" w:unhideWhenUsed="1"/>
+    <w:lsdException w:name="Table Classic 4" w:semiHidden="1" w:unhideWhenUsed="1"/>
+    <w:lsdException w:name="Table Colorful 1" w:semiHidden="1" w:unhideWhenUsed="1"/>
+    <w:lsdException w:name="Table Colorful 2" w:semiHidden="1" w:unhideWhenUsed="1"/>
+    <w:lsdException w:name="Table Colorful 3" w:semiHidden="1" w:unhideWhenUsed="1"/>
+    <w:lsdException w:name="Table Columns 1" w:semiHidden="1" w:unhideWhenUsed="1"/>
+    <w:lsdException w:name="Table Columns 2" w:semiHidden="1" w:unhideWhenUsed="1"/>
+    <w:lsdException w:name="Table Columns 3" w:semiHidden="1" w:unhideWhenUsed="1"/>
+    <w:lsdException w:name="Table Columns 4" w:semiHidden="1" w:unhideWhenUsed="1"/>
+    <w:lsdException w:name="Table Columns 5" w:semiHidden="1" w:unhideWhenUsed="1"/>
+    <w:lsdException w:name="Table Grid 1" w:semiHidden="1" w:unhideWhenUsed="1"/>
+    <w:lsdException w:name="Table Grid 2" w:semiHidden="1" w:unhideWhenUsed="1"/>
+    <w:lsdException w:name="Table Grid 3" w:semiHidden="1" w:unhideWhenUsed="1"/>
+    <w:lsdException w:name="Table Grid 4" w:semiHidden="1" w:unhideWhenUsed="1"/>
+    <w:lsdException w:name="Table Grid 5" w:semiHidden="1" w:unhideWhenUsed="1"/>
+    <w:lsdException w:name="Table Grid 6" w:semiHidden="1" w:unhideWhenUsed="1"/>
+    <w:lsdException w:name="Table Grid 7" w:semiHidden="1" w:unhideWhenUsed="1"/>
+    <w:lsdException w:name="Table Grid 8" w:semiHidden="1" w:unhideWhenUsed="1"/>
+    <w:lsdException w:name="Table List 1" w:semiHidden="1" w:unhideWhenUsed="1"/>
+    <w:lsdException w:name="Table List 2" w:semiHidden="1" w:unhideWhenUsed="1"/>
+    <w:lsdException w:name="Table List 3" w:semiHidden="1" w:unhideWhenUsed="1"/>
+    <w:lsdException w:name="Table List 4" w:semiHidden="1" w:unhideWhenUsed="1"/>
+    <w:lsdException w:name="Table List 5" w:semiHidden="1" w:unhideWhenUsed="1"/>
+    <w:lsdException w:name="Table List 6" w:semiHidden="1" w:unhideWhenUsed="1"/>
+    <w:lsdException w:name="Table List 7" w:semiHidden="1" w:unhideWhenUsed="1"/>
+    <w:lsdException w:name="Table List 8" w:semiHidden="1" w:unhideWhenUsed="1"/>
+    <w:lsdException w:name="Table 3D effects 1" w:semiHidden="1" w:unhideWhenUsed="1"/>
+    <w:lsdException w:name="Table 3D effects 2" w:semiHidden="1" w:unhideWhenUsed="1"/>
+    <w:lsdException w:name="Table 3D effects 3" w:semiHidden="1" w:unhideWhenUsed="1"/>
+    <w:lsdException w:name="Table Contemporary" w:semiHidden="1" w:unhideWhenUsed="1"/>
+    <w:lsdException w:name="Table Elegant" w:semiHidden="1" w:unhideWhenUsed="1"/>
+    <w:lsdException w:name="Table Professional" w:semiHidden="1" w:unhideWhenUsed="1"/>
+    <w:lsdException w:name="Table Subtle 1" w:semiHidden="1" w:unhideWhenUsed="1"/>
+    <w:lsdException w:name="Table Subtle 2" w:semiHidden="1" w:unhideWhenUsed="1"/>
+    <w:lsdException w:name="Table Web 1" w:semiHidden="1" w:unhideWhenUsed="1"/>
+    <w:lsdException w:name="Table Web 2" w:semiHidden="1" w:unhideWhenUsed="1"/>
+    <w:lsdException w:name="Table Web 3" w:semiHidden="1" w:unhideWhenUsed="1"/>
+    <w:lsdException w:name="Balloon Text" w:semiHidden="1" w:unhideWhenUsed="1"/>
+    <w:lsdException w:name="Table Grid" w:uiPriority="39"/>
+    <w:lsdException w:name="Table Theme" w:semiHidden="1" w:unhideWhenUsed="1"/>
+    <w:lsdException w:name="Placeholder Text" w:semiHidden="1"/>
+    <w:lsdException w:name="No Spacing" w:uiPriority="1" w:qFormat="1"/>
+    <w:lsdException w:name="Light Shading" w:uiPriority="60"/>
+    <w:lsdException w:name="Light List" w:uiPriority="61"/>
+    <w:lsdException w:name="Light Grid" w:uiPriority="62"/>
+    <w:lsdException w:name="Medium Shading 1" w:uiPriority="63"/>
+    <w:lsdException w:name="Medium Shading 2" w:uiPriority="64"/>
+    <w:lsdException w:name="Medium List 1" w:uiPriority="65"/>
+    <w:lsdException w:name="Medium List 2" w:uiPriority="66"/>
+    <w:lsdException w:name="Medium Grid 1" w:uiPriority="67"/>
+    <w:lsdException w:name="Medium Grid 2" w:uiPriority="68"/>
+    <w:lsdException w:name="Medium Grid 3" w:uiPriority="69"/>
+    <w:lsdException w:name="Dark List" w:uiPriority="70"/>
+    <w:lsdException w:name="Colorful Shading" w:uiPriority="71"/>
+    <w:lsdException w:name="Colorful List" w:uiPriority="72"/>
+    <w:lsdException w:name="Colorful Grid" w:uiPriority="73"/>
+    <w:lsdException w:name="Light Shading Accent 1" w:uiPriority="60"/>
+    <w:lsdException w:name="Light List Accent 1" w:uiPriority="61"/>
+    <w:lsdException w:name="Light Grid Accent 1" w:uiPriority="62"/>
+    <w:lsdException w:name="Medium Shading 1 Accent 1" w:uiPriority="63"/>
+    <w:lsdException w:name="Medium Shading 2 Accent 1" w:uiPriority="64"/>
+    <w:lsdException w:name="Medium List 1 Accent 1" w:uiPriority="65"/>
+    <w:lsdException w:name="Revision" w:semiHidden="1"/>
+    <w:lsdException w:name="List Paragraph" w:uiPriority="34" w:qFormat="1"/>
+    <w:lsdException w:name="Quote" w:uiPriority="29" w:qFormat="1"/>
+    <w:lsdException w:name="Intense Quote" w:uiPriority="30" w:qFormat="1"/>
+    <w:lsdException w:name="Medium List 2 Accent 1" w:uiPriority="66"/>
+    <w:lsdException w:name="Medium Grid 1 Accent 1" w:uiPriority="67"/>
+    <w:lsdException w:name="Medium Grid 2 Accent 1" w:uiPriority="68"/>
+    <w:lsdException w:name="Medium Grid 3 Accent 1" w:uiPriority="69"/>
+    <w:lsdException w:name="Dark List Accent 1" w:uiPriority="70"/>
+    <w:lsdException w:name="Colorful Shading Accent 1" w:uiPriority="71"/>
+    <w:lsdException w:name="Colorful List Accent 1" w:uiPriority="72"/>
+    <w:lsdException w:name="Colorful Grid Accent 1" w:uiPriority="73"/>
+    <w:lsdException w:name="Light Shading Accent 2" w:uiPriority="60"/>
+    <w:lsdException w:name="Light List Accent 2" w:uiPriority="61"/>
+    <w:lsdException w:name="Light Grid Accent 2" w:uiPriority="62"/>
+    <w:lsdException w:name="Medium Shading 1 Accent 2" w:uiPriority="63"/>
+    <w:lsdException w:name="Medium Shading 2 Accent 2" w:uiPriority="64"/>
+    <w:lsdException w:name="Medium List 1 Accent 2" w:uiPriority="65"/>
+    <w:lsdException w:name="Medium List 2 Accent 2" w:uiPriority="66"/>
+    <w:lsdException w:name="Medium Grid 1 Accent 2" w:uiPriority="67"/>
+    <w:lsdException w:name="Medium Grid 2 Accent 2" w:uiPriority="68"/>
+    <w:lsdException w:name="Medium Grid 3 Accent 2" w:uiPriority="69"/>
+    <w:lsdException w:name="Dark List Accent 2" w:uiPriority="70"/>
+    <w:lsdException w:name="Colorful Shading Accent 2" w:uiPriority="71"/>
+    <w:lsdException w:name="Colorful List Accent 2" w:uiPriority="72"/>
+    <w:lsdException w:name="Colorful Grid Accent 2" w:uiPriority="73"/>
+    <w:lsdException w:name="Light Shading Accent 3" w:uiPriority="60"/>
+    <w:lsdException w:name="Light List Accent 3" w:uiPriority="61"/>
+    <w:lsdException w:name="Light Grid Accent 3" w:uiPriority="62"/>
+    <w:lsdException w:name="Medium Shading 1 Accent 3" w:uiPriority="63"/>
+    <w:lsdException w:name="Medium Shading 2 Accent 3" w:uiPriority="64"/>
+    <w:lsdException w:name="Medium List 1 Accent 3" w:uiPriority="65"/>
+    <w:lsdException w:name="Medium List 2 Accent 3" w:uiPriority="66"/>
+    <w:lsdException w:name="Medium Grid 1 Accent 3" w:uiPriority="67"/>
+    <w:lsdException w:name="Medium Grid 2 Accent 3" w:uiPriority="68"/>
+    <w:lsdException w:name="Medium Grid 3 Accent 3" w:uiPriority="69"/>
+    <w:lsdException w:name="Dark List Accent 3" w:uiPriority="70"/>
+    <w:lsdException w:name="Colorful Shading Accent 3" w:uiPriority="71"/>
+    <w:lsdException w:name="Colorful List Accent 3" w:uiPriority="72"/>
+    <w:lsdException w:name="Colorful Grid Accent 3" w:uiPriority="73"/>
+    <w:lsdException w:name="Light Shading Accent 4" w:uiPriority="60"/>
+    <w:lsdException w:name="Light List Accent 4" w:uiPriority="61"/>
+    <w:lsdException w:name="Light Grid Accent 4" w:uiPriority="62"/>
+    <w:lsdException w:name="Medium Shading 1 Accent 4" w:uiPriority="63"/>
+    <w:lsdException w:name="Medium Shading 2 Accent 4" w:uiPriority="64"/>
+    <w:lsdException w:name="Medium List 1 Accent 4" w:uiPriority="65"/>
+    <w:lsdException w:name="Medium List 2 Accent 4" w:uiPriority="66"/>
+    <w:lsdException w:name="Medium Grid 1 Accent 4" w:uiPriority="67"/>
+    <w:lsdException w:name="Medium Grid 2 Accent 4" w:uiPriority="68"/>
+    <w:lsdException w:name="Medium Grid 3 Accent 4" w:uiPriority="69"/>
+    <w:lsdException w:name="Dark List Accent 4" w:uiPriority="70"/>
+    <w:lsdException w:name="Colorful Shading Accent 4" w:uiPriority="71"/>
+    <w:lsdException w:name="Colorful List Accent 4" w:uiPriority="72"/>
+    <w:lsdException w:name="Colorful Grid Accent 4" w:uiPriority="73"/>
+    <w:lsdException w:name="Light Shading Accent 5" w:uiPriority="60"/>
+    <w:lsdException w:name="Light List Accent 5" w:uiPriority="61"/>
+    <w:lsdException w:name="Light Grid Accent 5" w:uiPriority="62"/>
+    <w:lsdException w:name="Medium Shading 1 Accent 5" w:uiPriority="63"/>
+    <w:lsdException w:name="Medium Shading 2 Accent 5" w:uiPriority="64"/>
+    <w:lsdException w:name="Medium List 1 Accent 5" w:uiPriority="65"/>
+    <w:lsdException w:name="Medium List 2 Accent 5" w:uiPriority="66"/>
+    <w:lsdException w:name="Medium Grid 1 Accent 5" w:uiPriority="67"/>
+    <w:lsdException w:name="Medium Grid 2 Accent 5" w:uiPriority="68"/>
+    <w:lsdException w:name="Medium Grid 3 Accent 5" w:uiPriority="69"/>
+    <w:lsdException w:name="Dark List Accent 5" w:uiPriority="70"/>
+    <w:lsdException w:name="Colorful Shading Accent 5" w:uiPriority="71"/>
+    <w:lsdException w:name="Colorful List Accent 5" w:uiPriority="72"/>
+    <w:lsdException w:name="Colorful Grid Accent 5" w:uiPriority="73"/>
+    <w:lsdException w:name="Light Shading Accent 6" w:uiPriority="60"/>
+    <w:lsdException w:name="Light List Accent 6" w:uiPriority="61"/>
+    <w:lsdException w:name="Light Grid Accent 6" w:uiPriority="62"/>
+    <w:lsdException w:name="Medium Shading 1 Accent 6" w:uiPriority="63"/>
+    <w:lsdException w:name="Medium Shading 2 Accent 6" w:uiPriority="64"/>
+    <w:lsdException w:name="Medium List 1 Accent 6" w:uiPriority="65"/>
+    <w:lsdException w:name="Medium List 2 Accent 6" w:uiPriority="66"/>
+    <w:lsdException w:name="Medium Grid 1 Accent 6" w:uiPriority="67"/>
+    <w:lsdException w:name="Medium Grid 2 Accent 6" w:uiPriority="68"/>
+    <w:lsdException w:name="Medium Grid 3 Accent 6" w:uiPriority="69"/>
+    <w:lsdException w:name="Dark List Accent 6" w:uiPriority="70"/>
+    <w:lsdException w:name="Colorful Shading Accent 6" w:uiPriority="71"/>
+    <w:lsdException w:name="Colorful List Accent 6" w:uiPriority="72"/>
+    <w:lsdException w:name="Colorful Grid Accent 6" w:uiPriority="73"/>
+    <w:lsdException w:name="Subtle Emphasis" w:uiPriority="19" w:qFormat="1"/>
+    <w:lsdException w:name="Intense Emphasis" w:uiPriority="21" w:qFormat="1"/>
+    <w:lsdException w:name="Subtle Reference" w:uiPriority="31" w:qFormat="1"/>
+    <w:lsdException w:name="Intense Reference" w:uiPriority="32" w:qFormat="1"/>
+    <w:lsdException w:name="Book Title" w:uiPriority="33" w:qFormat="1"/>
+    <w:lsdException w:name="Bibliography" w:semiHidden="1" w:uiPriority="37" w:unhideWhenUsed="1"/>
+    <w:lsdException w:name="TOC Heading" w:semiHidden="1" w:uiPriority="39" w:unhideWhenUsed="1" w:qFormat="1"/>
+    <w:lsdException w:name="Plain Table 1" w:uiPriority="41"/>
+    <w:lsdException w:name="Plain Table 2" w:uiPriority="42"/>
+    <w:lsdException w:name="Plain Table 3" w:uiPriority="43"/>
+    <w:lsdException w:name="Plain Table 4" w:uiPriority="44"/>
+    <w:lsdException w:name="Plain Table 5" w:uiPriority="45"/>
+    <w:lsdException w:name="Grid Table Light" w:uiPriority="40"/>
+    <w:lsdException w:name="Grid Table 1 Light" w:uiPriority="46"/>
+    <w:lsdException w:name="Grid Table 2" w:uiPriority="47"/>
+    <w:lsdException w:name="Grid Table 3" w:uiPriority="48"/>
+    <w:lsdException w:name="Grid Table 4" w:uiPriority="49"/>
+    <w:lsdException w:name="Grid Table 5 Dark" w:uiPriority="50"/>
+    <w:lsdException w:name="Grid Table 6 Colorful" w:uiPriority="51"/>
+    <w:lsdException w:name="Grid Table 7 Colorful" w:uiPriority="52"/>
+    <w:lsdException w:name="Grid Table 1 Light Accent 1" w:uiPriority="46"/>
+    <w:lsdException w:name="Grid Table 2 Accent 1" w:uiPriority="47"/>
+    <w:lsdException w:name="Grid Table 3 Accent 1" w:uiPriority="48"/>
+    <w:lsdException w:name="Grid Table 4 Accent 1" w:uiPriority="49"/>
+    <w:lsdException w:name="Grid Table 5 Dark Accent 1" w:uiPriority="50"/>
+    <w:lsdException w:name="Grid Table 6 Colorful Accent 1" w:uiPriority="51"/>
+    <w:lsdException w:name="Grid Table 7 Colorful Accent 1" w:uiPriority="52"/>
+    <w:lsdException w:name="Grid Table 1 Light Accent 2" w:uiPriority="46"/>
+    <w:lsdException w:name="Grid Table 2 Accent 2" w:uiPriority="47"/>
+    <w:lsdException w:name="Grid Table 3 Accent 2" w:uiPriority="48"/>
+    <w:lsdException w:name="Grid Table 4 Accent 2" w:uiPriority="49"/>
+    <w:lsdException w:name="Grid Table 5 Dark Accent 2" w:uiPriority="50"/>
+    <w:lsdException w:name="Grid Table 6 Colorful Accent 2" w:uiPriority="51"/>
+    <w:lsdException w:name="Grid Table 7 Colorful Accent 2" w:uiPriority="52"/>
+    <w:lsdException w:name="Grid Table 1 Light Accent 3" w:uiPriority="46"/>
+    <w:lsdException w:name="Grid Table 2 Accent 3" w:uiPriority="47"/>
+    <w:lsdException w:name="Grid Table 3 Accent 3" w:uiPriority="48"/>
+    <w:lsdException w:name="Grid Table 4 Accent 3" w:uiPriority="49"/>
+    <w:lsdException w:name="Grid Table 5 Dark Accent 3" w:uiPriority="50"/>
+    <w:lsdException w:name="Grid Table 6 Colorful Accent 3" w:uiPriority="51"/>
+    <w:lsdException w:name="Grid Table 7 Colorful Accent 3" w:uiPriority="52"/>
+    <w:lsdException w:name="Grid Table 1 Light Accent 4" w:uiPriority="46"/>
+    <w:lsdException w:name="Grid Table 2 Accent 4" w:uiPriority="47"/>
+    <w:lsdException w:name="Grid Table 3 Accent 4" w:uiPriority="48"/>
+    <w:lsdException w:name="Grid Table 4 Accent 4" w:uiPriority="49"/>
+    <w:lsdException w:name="Grid Table 5 Dark Accent 4" w:uiPriority="50"/>
+    <w:lsdException w:name="Grid Table 6 Colorful Accent 4" w:uiPriority="51"/>
+    <w:lsdException w:name="Grid Table 7 Colorful Accent 4" w:uiPriority="52"/>
+    <w:lsdException w:name="Grid Table 1 Light Accent 5" w:uiPriority="46"/>
+    <w:lsdException w:name="Grid Table 2 Accent 5" w:uiPriority="47"/>
+    <w:lsdException w:name="Grid Table 3 Accent 5" w:uiPriority="48"/>
+    <w:lsdException w:name="Grid Table 4 Accent 5" w:uiPriority="49"/>
+    <w:lsdException w:name="Grid Table 5 Dark Accent 5" w:uiPriority="50"/>
+    <w:lsdException w:name="Grid Table 6 Colorful Accent 5" w:uiPriority="51"/>
+    <w:lsdException w:name="Grid Table 7 Colorful Accent 5" w:uiPriority="52"/>
+    <w:lsdException w:name="Grid Table 1 Light Accent 6" w:uiPriority="46"/>
+    <w:lsdException w:name="Grid Table 2 Accent 6" w:uiPriority="47"/>
+    <w:lsdException w:name="Grid Table 3 Accent 6" w:uiPriority="48"/>
+    <w:lsdException w:name="Grid Table 4 Accent 6" w:uiPriority="49"/>
+    <w:lsdException w:name="Grid Table 5 Dark Accent 6" w:uiPriority="50"/>
+    <w:lsdException w:name="Grid Table 6 Colorful Accent 6" w:uiPriority="51"/>
+    <w:lsdException w:name="Grid Table 7 Colorful Accent 6" w:uiPriority="52"/>
+    <w:lsdException w:name="List Table 1 Light" w:uiPriority="46"/>
+    <w:lsdException w:name="List Table 2" w:uiPriority="47"/>
+    <w:lsdException w:name="List Table 3" w:uiPriority="48"/>
+    <w:lsdException w:name="List Table 4" w:uiPriority="49"/>
+    <w:lsdException w:name="List Table 5 Dark" w:uiPriority="50"/>
+    <w:lsdException w:name="List Table 6 Colorful" w:uiPriority="51"/>
+    <w:lsdException w:name="List Table 7 Colorful" w:uiPriority="52"/>
+    <w:lsdException w:name="List Table 1 Light Accent 1" w:uiPriority="46"/>
+    <w:lsdException w:name="List Table 2 Accent 1" w:uiPriority="47"/>
+    <w:lsdException w:name="List Table 3 Accent 1" w:uiPriority="48"/>
+    <w:lsdException w:name="List Table 4 Accent 1" w:uiPriority="49"/>
+    <w:lsdException w:name="List Table 5 Dark Accent 1" w:uiPriority="50"/>
+    <w:lsdException w:name="List Table 6 Colorful Accent 1" w:uiPriority="51"/>
+    <w:lsdException w:name="List Table 7 Colorful Accent 1" w:uiPriority="52"/>
+    <w:lsdException w:name="List Table 1 Light Accent 2" w:uiPriority="46"/>
+    <w:lsdException w:name="List Table 2 Accent 2" w:uiPriority="47"/>
+    <w:lsdException w:name="List Table 3 Accent 2" w:uiPriority="48"/>
+    <w:lsdException w:name="List Table 4 Accent 2" w:uiPriority="49"/>
+    <w:lsdException w:name="List Table 5 Dark Accent 2" w:uiPriority="50"/>
+    <w:lsdException w:name="List Table 6 Colorful Accent 2" w:uiPriority="51"/>
+    <w:lsdException w:name="List Table 7 Colorful Accent 2" w:uiPriority="52"/>
+    <w:lsdException w:name="List Table 1 Light Accent 3" w:uiPriority="46"/>
+    <w:lsdException w:name="List Table 2 Accent 3" w:uiPriority="47"/>
+    <w:lsdException w:name="List Table 3 Accent 3" w:uiPriority="48"/>
+    <w:lsdException w:name="List Table 4 Accent 3" w:uiPriority="49"/>
+    <w:lsdException w:name="List Table 5 Dark Accent 3" w:uiPriority="50"/>
+    <w:lsdException w:name="List Table 6 Colorful Accent 3" w:uiPriority="51"/>
+    <w:lsdException w:name="List Table 7 Colorful Accent 3" w:uiPriority="52"/>
+    <w:lsdException w:name="List Table 1 Light Accent 4" w:uiPriority="46"/>
+    <w:lsdException w:name="List Table 2 Accent 4" w:uiPriority="47"/>
+    <w:lsdException w:name="List Table 3 Accent 4" w:uiPriority="48"/>
+    <w:lsdException w:name="List Table 4 Accent 4" w:uiPriority="49"/>
+    <w:lsdException w:name="List Table 5 Dark Accent 4" w:uiPriority="50"/>
+    <w:lsdException w:name="List Table 6 Colorful Accent 4" w:uiPriority="51"/>
+    <w:lsdException w:name="List Table 7 Colorful Accent 4" w:uiPriority="52"/>
+    <w:lsdException w:name="List Table 1 Light Accent 5" w:uiPriority="46"/>
+    <w:lsdException w:name="List Table 2 Accent 5" w:uiPriority="47"/>
+    <w:lsdException w:name="List Table 3 Accent 5" w:uiPriority="48"/>
+    <w:lsdException w:name="List Table 4 Accent 5" w:uiPriority="49"/>
+    <w:lsdException w:name="List Table 5 Dark Accent 5" w:uiPriority="50"/>
+    <w:lsdException w:name="List Table 6 Colorful Accent 5" w:uiPriority="51"/>
+    <w:lsdException w:name="List Table 7 Colorful Accent 5" w:uiPriority="52"/>
+    <w:lsdException w:name="List Table 1 Light Accent 6" w:uiPriority="46"/>
+    <w:lsdException w:name="List Table 2 Accent 6" w:uiPriority="47"/>
+    <w:lsdException w:name="List Table 3 Accent 6" w:uiPriority="48"/>
+    <w:lsdException w:name="List Table 4 Accent 6" w:uiPriority="49"/>
+    <w:lsdException w:name="List Table 5 Dark Accent 6" w:uiPriority="50"/>
+    <w:lsdException w:name="List Table 6 Colorful Accent 6" w:uiPriority="51"/>
+    <w:lsdException w:name="List Table 7 Colorful Accent 6" w:uiPriority="52"/>
+    <w:lsdException w:name="Mention" w:semiHidden="1" w:unhideWhenUsed="1"/>
+    <w:lsdException w:name="Smart Hyperlink" w:semiHidden="1" w:unhideWhenUsed="1"/>
+    <w:lsdException w:name="Hashtag" w:semiHidden="1" w:unhideWhenUsed="1"/>
+    <w:lsdException w:name="Unresolved Mention" w:semiHidden="1" w:unhideWhenUsed="1"/>
+    <w:lsdException w:name="Smart Link" w:semiHidden="1" w:unhideWhenUsed="1"/>
+  </w:latentStyles>
+  <w:style w:type="paragraph" w:default="1" w:styleId="Normal">
+    <w:name w:val="Normal"/>
+    <w:qFormat/>
   </w:style>
   <w:style w:type="paragraph" w:styleId="Heading1">
     <w:name w:val="heading 1"/>
-    <w:basedOn w:val="Normal"/>
-    <w:next w:val="Normal"/>
     <w:uiPriority w:val="9"/>
     <w:qFormat/>
     <w:pPr>
@@ -1070,8 +2148,6 @@
   </w:style>
   <w:style w:type="paragraph" w:styleId="Heading2">
     <w:name w:val="heading 2"/>
-    <w:basedOn w:val="Normal"/>
-    <w:next w:val="Normal"/>
     <w:uiPriority w:val="9"/>
     <w:unhideWhenUsed/>
     <w:qFormat/>
@@ -1089,8 +2165,6 @@
   </w:style>
   <w:style w:type="paragraph" w:styleId="Heading3">
     <w:name w:val="heading 3"/>
-    <w:basedOn w:val="Normal"/>
-    <w:next w:val="Normal"/>
     <w:uiPriority w:val="9"/>
     <w:semiHidden/>
     <w:unhideWhenUsed/>
@@ -1109,8 +2183,6 @@
   </w:style>
   <w:style w:type="paragraph" w:styleId="Heading4">
     <w:name w:val="heading 4"/>
-    <w:basedOn w:val="Normal"/>
-    <w:next w:val="Normal"/>
     <w:uiPriority w:val="9"/>
     <w:semiHidden/>
     <w:unhideWhenUsed/>
@@ -1129,8 +2201,6 @@
   </w:style>
   <w:style w:type="paragraph" w:styleId="Heading5">
     <w:name w:val="heading 5"/>
-    <w:basedOn w:val="Normal"/>
-    <w:next w:val="Normal"/>
     <w:uiPriority w:val="9"/>
     <w:semiHidden/>
     <w:unhideWhenUsed/>
@@ -1147,8 +2217,6 @@
   </w:style>
   <w:style w:type="paragraph" w:styleId="Heading6">
     <w:name w:val="heading 6"/>
-    <w:basedOn w:val="Normal"/>
-    <w:next w:val="Normal"/>
     <w:uiPriority w:val="9"/>
     <w:semiHidden/>
     <w:unhideWhenUsed/>
@@ -1163,6 +2231,40 @@
       <w:b/>
       <w:sz w:val="20"/>
       <w:szCs w:val="20"/>
+    </w:rPr>
+  </w:style>
+  <w:style w:type="character" w:default="1" w:styleId="DefaultParagraphFont">
+    <w:name w:val="Default Paragraph Font"/>
+    <w:uiPriority w:val="1"/>
+    <w:semiHidden/>
+    <w:unhideWhenUsed/>
+  </w:style>
+  <w:style w:type="table" w:default="1" w:styleId="TableNormal">
+    <w:name w:val="Normal Table"/>
+    <w:uiPriority w:val="99"/>
+    <w:semiHidden/>
+    <w:unhideWhenUsed/>
+    <w:tblPr>
+      <w:tblInd w:w="0" w:type="dxa"/>
+      <w:tblCellMar>
+        <w:top w:w="0" w:type="dxa"/>
+        <w:left w:w="108" w:type="dxa"/>
+        <w:bottom w:w="0" w:type="dxa"/>
+        <w:right w:w="108" w:type="dxa"/>
+      </w:tblCellMar>
+    </w:tblPr>
+  </w:style>
+  <w:style w:type="numbering" w:default="1" w:styleId="NoList">
+    <w:name w:val="No List"/>
+    <w:uiPriority w:val="99"/>
+    <w:semiHidden/>
+    <w:unhideWhenUsed/>
+  </w:style>
+  <w:style w:type="character" w:styleId="Hyperlink">
+    <w:name w:val="Hyperlink"/>
+    <w:rPr>
+      <w:color w:val="0000FF"/>
+      <w:u w:val="single"/>
     </w:rPr>
   </w:style>
 </w:styles>
@@ -1359,5 +2461,7 @@
       </a:bgFillStyleLst>
     </a:fmtScheme>
   </a:themeElements>
+  <a:objectDefaults/>
+  <a:extraClrSchemeLst/>
 </a:theme>
 </file>
</xml_diff>